<commit_message>
Update AR follow-up automation system
</commit_message>
<xml_diff>
--- a/RecoverAI_Comprehensive_System_Architecture_and_Guide.docx
+++ b/RecoverAI_Comprehensive_System_Architecture_and_Guide.docx
@@ -4,13 +4,14 @@
   <w:body>
     <w:p>
       <w:pPr>
-        <w:spacing w:before="240" w:after="80"/>
+        <w:spacing w:before="0" w:after="80"/>
       </w:pPr>
       <w:r>
         <w:rPr>
+          <w:rFonts w:ascii="Calibri" w:hAnsi="Calibri"/>
           <w:b/>
-          <w:color w:val="0A2540"/>
-          <w:sz w:val="48"/>
+          <w:color w:val="1E3A8A"/>
+          <w:sz w:val="44"/>
         </w:rPr>
         <w:t>RecoverAI — Autonomous AR Follow-Up &amp; Revenue Cycle AI Platform</w:t>
       </w:r>
@@ -21,32 +22,92 @@
       </w:pPr>
       <w:r>
         <w:rPr>
-          <w:color w:val="2563EB"/>
+          <w:rFonts w:ascii="Calibri" w:hAnsi="Calibri"/>
+          <w:i/>
+          <w:color w:val="475569"/>
           <w:sz w:val="26"/>
         </w:rPr>
-        <w:t>Comprehensive System Architecture, Machine Learning Intelligence, Payer Policy Vector RAG, and Closed-Loop Autonomous Recovery Engine</w:t>
+        <w:t>Comprehensive System Architecture, Machine Learning Models, Vector RAG Knowledge Base, and Operational Guide</w:t>
+      </w:r>
+    </w:p>
+    <w:p>
+      <w:pPr>
+        <w:spacing w:after="400"/>
+      </w:pPr>
+      <w:r>
+        <w:rPr>
+          <w:b/>
+        </w:rPr>
+        <w:t xml:space="preserve">Document Version: </w:t>
+      </w:r>
+      <w:r>
+        <w:t xml:space="preserve">1.0.0  |  </w:t>
+      </w:r>
+      <w:r>
+        <w:rPr>
+          <w:b/>
+        </w:rPr>
+        <w:t xml:space="preserve">Platform Engine: </w:t>
+      </w:r>
+      <w:r>
+        <w:t xml:space="preserve">FastAPI + React 19 + Scikit-Learn  |  </w:t>
+      </w:r>
+      <w:r>
+        <w:rPr>
+          <w:b/>
+        </w:rPr>
+        <w:t xml:space="preserve">Target Audience: </w:t>
+      </w:r>
+      <w:r>
+        <w:t>Executives, RCM Directors, Engineers &amp; Data Scientists</w:t>
+      </w:r>
+    </w:p>
+    <w:p>
+      <w:pPr>
+        <w:spacing w:after="80"/>
+      </w:pPr>
+    </w:p>
+    <w:p>
+      <w:pPr>
+        <w:pStyle w:val="Heading1"/>
+        <w:spacing w:before="280" w:after="120"/>
+      </w:pPr>
+      <w:r>
+        <w:t>1. Executive Summary &amp; Healthcare Revenue Context</w:t>
+      </w:r>
+    </w:p>
+    <w:p>
+      <w:r>
+        <w:t>RecoverAI is an autonomous artificial intelligence platform engineered specifically for healthcare revenue cycle management (RCM), hospital billing operations, and physician practices. The platform eliminates the manual bottlenecks of insurance claim follow-ups, denial dispute packet creation, and revenue recovery.</w:t>
       </w:r>
     </w:p>
     <w:tbl>
       <w:tblPr>
         <w:tblW w:type="auto" w:w="0"/>
         <w:jc w:val="center"/>
+        <w:tblLayout w:type="fixed"/>
         <w:tblLook w:firstColumn="1" w:firstRow="1" w:lastColumn="0" w:lastRow="0" w:noHBand="0" w:noVBand="1" w:val="04A0"/>
       </w:tblPr>
       <w:tblGrid>
-        <w:gridCol w:w="9936"/>
+        <w:gridCol w:w="9360"/>
       </w:tblGrid>
       <w:tr>
         <w:tc>
           <w:tcPr>
-            <w:tcW w:type="dxa" w:w="9936"/>
-            <w:shd w:fill="F0F9FF"/>
+            <w:tcW w:type="dxa" w:w="9360"/>
+            <w:shd w:fill="EFF6FF"/>
             <w:tcMar>
               <w:top w:w="140" w:type="dxa"/>
               <w:bottom w:w="140" w:type="dxa"/>
               <w:left w:w="200" w:type="dxa"/>
               <w:right w:w="200" w:type="dxa"/>
             </w:tcMar>
+            <w:tcBorders>
+              <w:top w:val="none"/>
+              <w:bottom w:val="none"/>
+              <w:left w:val="single" w:sz="24" w:space="0" w:color="3B82F6"/>
+              <w:right w:val="none"/>
+            </w:tcBorders>
           </w:tcPr>
           <w:p>
             <w:pPr>
@@ -55,30 +116,515 @@
             <w:r>
               <w:rPr>
                 <w:b/>
-                <w:color w:val="004488"/>
+                <w:color w:val="1E3A8A"/>
                 <w:sz w:val="21"/>
               </w:rPr>
-              <w:t>📌 System Metadata &amp; Architecture Specifications</w:t>
+              <w:t>📌 The $260 Billion Problem: Healthcare Claim Denials &amp; AR Aging</w:t>
               <w:br/>
             </w:r>
             <w:r>
               <w:rPr>
-                <w:color w:val="223344"/>
+                <w:color w:val="334155"/>
                 <w:sz w:val="19"/>
               </w:rPr>
-              <w:t>• Project: RecoverAI (Accounts Receivable Follow-Up AI)</w:t>
+              <w:t>• $260+ Billion in Annual Denials: Approximately 15% to 20% of all medical claims submitted to commercial and government insurance payers are initially denied or delayed.</w:t>
               <w:br/>
-              <w:t>• Production Dataset: 10,000 Hospital Claims | 10 Payers | 40 Policy Chunks | 10,000 Outcomes ($44.05M AR)</w:t>
+              <w:t>• Revenue Leakage &amp; Aging: Claims languish in Accounts Receivable (AR) past 30, 60, 90, or 120+ days. Without timely clinical appeals, these claims exceed strict timely filing limits and are written off as uncollectible bad debt.</w:t>
               <w:br/>
-              <w:t>• Machine Learning: Dual HistGradientBoosting Classifiers (Delay ROC-AUC 0.746 | Denial ROC-AUC 0.782)</w:t>
+              <w:t>• Labor-Intensive Workflow: Hospital staff spend hours manually logging into payer portals, waiting on phone hold queues, and writing manual appeals.</w:t>
               <w:br/>
-              <w:t>• Knowledge Architecture: TF-IDF Vector Space Model + Cosine Similarity Payer Policy RAG</w:t>
-              <w:br/>
-              <w:t>• Decision Architecture: Autonomous AI Follow-Up Agent + Multi-Format CMS/UB-04 Generator</w:t>
-              <w:br/>
-              <w:t>• Adjudication Engine: Probabilistic 4-Class Payer Response Simulator &amp; Ledger State Committer</w:t>
-              <w:br/>
-              <w:t>• Core Frameworks: Python 3.14, FastAPI, SQLAlchemy, SQLite, React 19, TypeScript, Vite, Tailwind CSS, Recharts</w:t>
+              <w:t>• Arbitrary Prioritization: Human teams work claims randomly rather than optimizing for mathematically expected dollar recovery.</w:t>
+            </w:r>
+          </w:p>
+        </w:tc>
+      </w:tr>
+    </w:tbl>
+    <w:p>
+      <w:pPr>
+        <w:spacing w:after="120"/>
+      </w:pPr>
+    </w:p>
+    <w:p>
+      <w:r>
+        <w:t>RecoverAI solves these challenges by combining dual machine learning classifiers, a financially-aware priority yield algorithm, a grounded TF-IDF vector policy retrieval engine (RAG), a multi-format communication synthesizer, a 4-class adjudication simulator, and an autonomous closed-loop execution pipeline.</w:t>
+      </w:r>
+    </w:p>
+    <w:p>
+      <w:pPr>
+        <w:pStyle w:val="Heading1"/>
+        <w:spacing w:before="280" w:after="120"/>
+      </w:pPr>
+      <w:r>
+        <w:t>2. High-Level Architecture &amp; End-to-End Data Pipeline</w:t>
+      </w:r>
+    </w:p>
+    <w:p>
+      <w:r>
+        <w:t>The platform is structured into five cohesive layers operating in real time:</w:t>
+      </w:r>
+    </w:p>
+    <w:tbl>
+      <w:tblPr>
+        <w:tblW w:type="auto" w:w="0"/>
+        <w:jc w:val="center"/>
+        <w:tblLook w:firstColumn="1" w:firstRow="1" w:lastColumn="0" w:lastRow="0" w:noHBand="0" w:noVBand="1" w:val="04A0"/>
+        <w:tblBorders>
+          <w:top w:val="single" w:sz="4" w:space="0" w:color="CBD5E1"/>
+          <w:bottom w:val="single" w:sz="4" w:space="0" w:color="CBD5E1"/>
+          <w:left w:val="none"/>
+          <w:right w:val="none"/>
+          <w:insideH w:val="single" w:sz="4" w:space="0" w:color="CBD5E1"/>
+          <w:insideV w:val="none"/>
+        </w:tblBorders>
+      </w:tblPr>
+      <w:tblGrid>
+        <w:gridCol w:w="3120"/>
+        <w:gridCol w:w="3120"/>
+        <w:gridCol w:w="3120"/>
+      </w:tblGrid>
+      <w:tr>
+        <w:tc>
+          <w:tcPr>
+            <w:tcW w:type="dxa" w:w="3120"/>
+            <w:shd w:fill="1E3A8A"/>
+            <w:tcMar>
+              <w:top w:w="140" w:type="dxa"/>
+              <w:bottom w:w="140" w:type="dxa"/>
+              <w:left w:w="160" w:type="dxa"/>
+              <w:right w:w="160" w:type="dxa"/>
+            </w:tcMar>
+          </w:tcPr>
+          <w:p>
+            <w:pPr>
+              <w:spacing w:before="40" w:after="40"/>
+            </w:pPr>
+            <w:r>
+              <w:rPr>
+                <w:b/>
+                <w:color w:val="FFFFFF"/>
+                <w:sz w:val="20"/>
+              </w:rPr>
+              <w:t>Layer</w:t>
+            </w:r>
+          </w:p>
+        </w:tc>
+        <w:tc>
+          <w:tcPr>
+            <w:tcW w:type="dxa" w:w="3120"/>
+            <w:shd w:fill="1E3A8A"/>
+            <w:tcMar>
+              <w:top w:w="140" w:type="dxa"/>
+              <w:bottom w:w="140" w:type="dxa"/>
+              <w:left w:w="160" w:type="dxa"/>
+              <w:right w:w="160" w:type="dxa"/>
+            </w:tcMar>
+          </w:tcPr>
+          <w:p>
+            <w:pPr>
+              <w:spacing w:before="40" w:after="40"/>
+            </w:pPr>
+            <w:r>
+              <w:rPr>
+                <w:b/>
+                <w:color w:val="FFFFFF"/>
+                <w:sz w:val="20"/>
+              </w:rPr>
+              <w:t>Components / Modules</w:t>
+            </w:r>
+          </w:p>
+        </w:tc>
+        <w:tc>
+          <w:tcPr>
+            <w:tcW w:type="dxa" w:w="3120"/>
+            <w:shd w:fill="1E3A8A"/>
+            <w:tcMar>
+              <w:top w:w="140" w:type="dxa"/>
+              <w:bottom w:w="140" w:type="dxa"/>
+              <w:left w:w="160" w:type="dxa"/>
+              <w:right w:w="160" w:type="dxa"/>
+            </w:tcMar>
+          </w:tcPr>
+          <w:p>
+            <w:pPr>
+              <w:spacing w:before="40" w:after="40"/>
+            </w:pPr>
+            <w:r>
+              <w:rPr>
+                <w:b/>
+                <w:color w:val="FFFFFF"/>
+                <w:sz w:val="20"/>
+              </w:rPr>
+              <w:t>Primary Operational Role</w:t>
+            </w:r>
+          </w:p>
+        </w:tc>
+      </w:tr>
+      <w:tr>
+        <w:tc>
+          <w:tcPr>
+            <w:tcW w:type="dxa" w:w="3120"/>
+            <w:shd w:fill="F8FAFC"/>
+            <w:tcMar>
+              <w:top w:w="100" w:type="dxa"/>
+              <w:bottom w:w="100" w:type="dxa"/>
+              <w:left w:w="160" w:type="dxa"/>
+              <w:right w:w="160" w:type="dxa"/>
+            </w:tcMar>
+          </w:tcPr>
+          <w:p>
+            <w:pPr>
+              <w:spacing w:before="40" w:after="40"/>
+            </w:pPr>
+            <w:r>
+              <w:rPr>
+                <w:color w:val="1F2937"/>
+                <w:sz w:val="19"/>
+              </w:rPr>
+              <w:t>Data &amp; Storage Layer</w:t>
+            </w:r>
+          </w:p>
+        </w:tc>
+        <w:tc>
+          <w:tcPr>
+            <w:tcW w:type="dxa" w:w="3120"/>
+            <w:shd w:fill="F8FAFC"/>
+            <w:tcMar>
+              <w:top w:w="100" w:type="dxa"/>
+              <w:bottom w:w="100" w:type="dxa"/>
+              <w:left w:w="160" w:type="dxa"/>
+              <w:right w:w="160" w:type="dxa"/>
+            </w:tcMar>
+          </w:tcPr>
+          <w:p>
+            <w:pPr>
+              <w:spacing w:before="40" w:after="40"/>
+            </w:pPr>
+            <w:r>
+              <w:rPr>
+                <w:color w:val="1F2937"/>
+                <w:sz w:val="19"/>
+              </w:rPr>
+              <w:t>SQLite (ar_followup.db), SQLAlchemy 2.0 ORM, 10,000 Claims Corpus</w:t>
+            </w:r>
+          </w:p>
+        </w:tc>
+        <w:tc>
+          <w:tcPr>
+            <w:tcW w:type="dxa" w:w="3120"/>
+            <w:shd w:fill="F8FAFC"/>
+            <w:tcMar>
+              <w:top w:w="100" w:type="dxa"/>
+              <w:bottom w:w="100" w:type="dxa"/>
+              <w:left w:w="160" w:type="dxa"/>
+              <w:right w:w="160" w:type="dxa"/>
+            </w:tcMar>
+          </w:tcPr>
+          <w:p>
+            <w:pPr>
+              <w:spacing w:before="40" w:after="40"/>
+            </w:pPr>
+            <w:r>
+              <w:rPr>
+                <w:color w:val="1F2937"/>
+                <w:sz w:val="19"/>
+              </w:rPr>
+              <w:t>Maintains 10,000 realistic claims, 10 payer policy profiles, 10,109 follow-up records, and longitudinal recovery outcomes.</w:t>
+            </w:r>
+          </w:p>
+        </w:tc>
+      </w:tr>
+      <w:tr>
+        <w:tc>
+          <w:tcPr>
+            <w:tcW w:type="dxa" w:w="3120"/>
+            <w:shd w:fill="FFFFFF"/>
+            <w:tcMar>
+              <w:top w:w="100" w:type="dxa"/>
+              <w:bottom w:w="100" w:type="dxa"/>
+              <w:left w:w="160" w:type="dxa"/>
+              <w:right w:w="160" w:type="dxa"/>
+            </w:tcMar>
+          </w:tcPr>
+          <w:p>
+            <w:pPr>
+              <w:spacing w:before="40" w:after="40"/>
+            </w:pPr>
+            <w:r>
+              <w:rPr>
+                <w:color w:val="1F2937"/>
+                <w:sz w:val="19"/>
+              </w:rPr>
+              <w:t>Intelligence &amp; ML Layer</w:t>
+            </w:r>
+          </w:p>
+        </w:tc>
+        <w:tc>
+          <w:tcPr>
+            <w:tcW w:type="dxa" w:w="3120"/>
+            <w:shd w:fill="FFFFFF"/>
+            <w:tcMar>
+              <w:top w:w="100" w:type="dxa"/>
+              <w:bottom w:w="100" w:type="dxa"/>
+              <w:left w:w="160" w:type="dxa"/>
+              <w:right w:w="160" w:type="dxa"/>
+            </w:tcMar>
+          </w:tcPr>
+          <w:p>
+            <w:pPr>
+              <w:spacing w:before="40" w:after="40"/>
+            </w:pPr>
+            <w:r>
+              <w:rPr>
+                <w:color w:val="1F2937"/>
+                <w:sz w:val="19"/>
+              </w:rPr>
+              <w:t>Dual HistGradientBoosting Models, Priority Scoring Engine</w:t>
+            </w:r>
+          </w:p>
+        </w:tc>
+        <w:tc>
+          <w:tcPr>
+            <w:tcW w:type="dxa" w:w="3120"/>
+            <w:shd w:fill="FFFFFF"/>
+            <w:tcMar>
+              <w:top w:w="100" w:type="dxa"/>
+              <w:bottom w:w="100" w:type="dxa"/>
+              <w:left w:w="160" w:type="dxa"/>
+              <w:right w:w="160" w:type="dxa"/>
+            </w:tcMar>
+          </w:tcPr>
+          <w:p>
+            <w:pPr>
+              <w:spacing w:before="40" w:after="40"/>
+            </w:pPr>
+            <w:r>
+              <w:rPr>
+                <w:color w:val="1F2937"/>
+                <w:sz w:val="19"/>
+              </w:rPr>
+              <w:t>Predicts P(Delay) and P(Denial), calculates transparent P(Recovery), and assigns 0-100 Priority Scores into Critical/High/Med/Low bands.</w:t>
+            </w:r>
+          </w:p>
+        </w:tc>
+      </w:tr>
+      <w:tr>
+        <w:tc>
+          <w:tcPr>
+            <w:tcW w:type="dxa" w:w="3120"/>
+            <w:shd w:fill="F8FAFC"/>
+            <w:tcMar>
+              <w:top w:w="100" w:type="dxa"/>
+              <w:bottom w:w="100" w:type="dxa"/>
+              <w:left w:w="160" w:type="dxa"/>
+              <w:right w:w="160" w:type="dxa"/>
+            </w:tcMar>
+          </w:tcPr>
+          <w:p>
+            <w:pPr>
+              <w:spacing w:before="40" w:after="40"/>
+            </w:pPr>
+            <w:r>
+              <w:rPr>
+                <w:color w:val="1F2937"/>
+                <w:sz w:val="19"/>
+              </w:rPr>
+              <w:t>Vector RAG Policy Layer</w:t>
+            </w:r>
+          </w:p>
+        </w:tc>
+        <w:tc>
+          <w:tcPr>
+            <w:tcW w:type="dxa" w:w="3120"/>
+            <w:shd w:fill="F8FAFC"/>
+            <w:tcMar>
+              <w:top w:w="100" w:type="dxa"/>
+              <w:bottom w:w="100" w:type="dxa"/>
+              <w:left w:w="160" w:type="dxa"/>
+              <w:right w:w="160" w:type="dxa"/>
+            </w:tcMar>
+          </w:tcPr>
+          <w:p>
+            <w:pPr>
+              <w:spacing w:before="40" w:after="40"/>
+            </w:pPr>
+            <w:r>
+              <w:rPr>
+                <w:color w:val="1F2937"/>
+                <w:sz w:val="19"/>
+              </w:rPr>
+              <w:t>TfidfVectorizer, Cosine Similarity Index, 40 Policy Chunks</w:t>
+            </w:r>
+          </w:p>
+        </w:tc>
+        <w:tc>
+          <w:tcPr>
+            <w:tcW w:type="dxa" w:w="3120"/>
+            <w:shd w:fill="F8FAFC"/>
+            <w:tcMar>
+              <w:top w:w="100" w:type="dxa"/>
+              <w:bottom w:w="100" w:type="dxa"/>
+              <w:left w:w="160" w:type="dxa"/>
+              <w:right w:w="160" w:type="dxa"/>
+            </w:tcMar>
+          </w:tcPr>
+          <w:p>
+            <w:pPr>
+              <w:spacing w:before="40" w:after="40"/>
+            </w:pPr>
+            <w:r>
+              <w:rPr>
+                <w:color w:val="1F2937"/>
+                <w:sz w:val="19"/>
+              </w:rPr>
+              <w:t>Indexes payer timely filing windows, mandatory clinical documentation requirements, dispute steps, and contact protocols.</w:t>
+            </w:r>
+          </w:p>
+        </w:tc>
+      </w:tr>
+      <w:tr>
+        <w:tc>
+          <w:tcPr>
+            <w:tcW w:type="dxa" w:w="3120"/>
+            <w:shd w:fill="FFFFFF"/>
+            <w:tcMar>
+              <w:top w:w="100" w:type="dxa"/>
+              <w:bottom w:w="100" w:type="dxa"/>
+              <w:left w:w="160" w:type="dxa"/>
+              <w:right w:w="160" w:type="dxa"/>
+            </w:tcMar>
+          </w:tcPr>
+          <w:p>
+            <w:pPr>
+              <w:spacing w:before="40" w:after="40"/>
+            </w:pPr>
+            <w:r>
+              <w:rPr>
+                <w:color w:val="1F2937"/>
+                <w:sz w:val="19"/>
+              </w:rPr>
+              <w:t>Autonomous Agent &amp; Generator</w:t>
+            </w:r>
+          </w:p>
+        </w:tc>
+        <w:tc>
+          <w:tcPr>
+            <w:tcW w:type="dxa" w:w="3120"/>
+            <w:shd w:fill="FFFFFF"/>
+            <w:tcMar>
+              <w:top w:w="100" w:type="dxa"/>
+              <w:bottom w:w="100" w:type="dxa"/>
+              <w:left w:w="160" w:type="dxa"/>
+              <w:right w:w="160" w:type="dxa"/>
+            </w:tcMar>
+          </w:tcPr>
+          <w:p>
+            <w:pPr>
+              <w:spacing w:before="40" w:after="40"/>
+            </w:pPr>
+            <w:r>
+              <w:rPr>
+                <w:color w:val="1F2937"/>
+                <w:sz w:val="19"/>
+              </w:rPr>
+              <w:t>AIFollowUpAgent, Multi-Format Artifact Generator</w:t>
+            </w:r>
+          </w:p>
+        </w:tc>
+        <w:tc>
+          <w:tcPr>
+            <w:tcW w:type="dxa" w:w="3120"/>
+            <w:shd w:fill="FFFFFF"/>
+            <w:tcMar>
+              <w:top w:w="100" w:type="dxa"/>
+              <w:bottom w:w="100" w:type="dxa"/>
+              <w:left w:w="160" w:type="dxa"/>
+              <w:right w:w="160" w:type="dxa"/>
+            </w:tcMar>
+          </w:tcPr>
+          <w:p>
+            <w:pPr>
+              <w:spacing w:before="40" w:after="40"/>
+            </w:pPr>
+            <w:r>
+              <w:rPr>
+                <w:color w:val="1F2937"/>
+                <w:sz w:val="19"/>
+              </w:rPr>
+              <w:t>Formulates optimal action (Appeal, Inquiry, Resubmission, Escalation) and drafts formal CMS-1500/UB-04 letters, portal notes, and phone scripts.</w:t>
+            </w:r>
+          </w:p>
+        </w:tc>
+      </w:tr>
+      <w:tr>
+        <w:tc>
+          <w:tcPr>
+            <w:tcW w:type="dxa" w:w="3120"/>
+            <w:shd w:fill="F8FAFC"/>
+            <w:tcMar>
+              <w:top w:w="100" w:type="dxa"/>
+              <w:bottom w:w="100" w:type="dxa"/>
+              <w:left w:w="160" w:type="dxa"/>
+              <w:right w:w="160" w:type="dxa"/>
+            </w:tcMar>
+          </w:tcPr>
+          <w:p>
+            <w:pPr>
+              <w:spacing w:before="40" w:after="40"/>
+            </w:pPr>
+            <w:r>
+              <w:rPr>
+                <w:color w:val="1F2937"/>
+                <w:sz w:val="19"/>
+              </w:rPr>
+              <w:t>Simulation &amp; Closed-Loop</w:t>
+            </w:r>
+          </w:p>
+        </w:tc>
+        <w:tc>
+          <w:tcPr>
+            <w:tcW w:type="dxa" w:w="3120"/>
+            <w:shd w:fill="F8FAFC"/>
+            <w:tcMar>
+              <w:top w:w="100" w:type="dxa"/>
+              <w:bottom w:w="100" w:type="dxa"/>
+              <w:left w:w="160" w:type="dxa"/>
+              <w:right w:w="160" w:type="dxa"/>
+            </w:tcMar>
+          </w:tcPr>
+          <w:p>
+            <w:pPr>
+              <w:spacing w:before="40" w:after="40"/>
+            </w:pPr>
+            <w:r>
+              <w:rPr>
+                <w:color w:val="1F2937"/>
+                <w:sz w:val="19"/>
+              </w:rPr>
+              <w:t>PayerResponseSimulator, ClosedLoopRecoveryEngine</w:t>
+            </w:r>
+          </w:p>
+        </w:tc>
+        <w:tc>
+          <w:tcPr>
+            <w:tcW w:type="dxa" w:w="3120"/>
+            <w:shd w:fill="F8FAFC"/>
+            <w:tcMar>
+              <w:top w:w="100" w:type="dxa"/>
+              <w:bottom w:w="100" w:type="dxa"/>
+              <w:left w:w="160" w:type="dxa"/>
+              <w:right w:w="160" w:type="dxa"/>
+            </w:tcMar>
+          </w:tcPr>
+          <w:p>
+            <w:pPr>
+              <w:spacing w:before="40" w:after="40"/>
+            </w:pPr>
+            <w:r>
+              <w:rPr>
+                <w:color w:val="1F2937"/>
+                <w:sz w:val="19"/>
+              </w:rPr>
+              <w:t>Executes 4-class adjudication simulation (Approved Full, Partial, Additional Info, Denied), applies database ledger updates, and logs recoveries.</w:t>
             </w:r>
           </w:p>
         </w:tc>
@@ -92,90 +638,15 @@
     <w:p>
       <w:pPr>
         <w:pStyle w:val="Heading1"/>
-        <w:spacing w:before="280"/>
+        <w:spacing w:before="280" w:after="120"/>
       </w:pPr>
       <w:r>
-        <w:t>1. Executive Summary &amp; Healthcare Problem Statement</w:t>
+        <w:t>3. Machine Learning Models &amp; Mathematical Formulations</w:t>
       </w:r>
     </w:p>
     <w:p>
       <w:r>
-        <w:t>Accounts Receivable (AR) follow-up and denial management represent one of the most critical administrative and financial bottlenecks in the United States healthcare ecosystem. Health systems, hospitals, and physician groups lose billions of dollars annually due to unpaid, delayed, or improperly denied medical insurance claims.</w:t>
-      </w:r>
-    </w:p>
-    <w:p>
-      <w:pPr>
-        <w:pStyle w:val="Heading2"/>
-      </w:pPr>
-      <w:r>
-        <w:t>1.1 The Industry Problem</w:t>
-      </w:r>
-    </w:p>
-    <w:p>
-      <w:r>
-        <w:rPr>
-          <w:b/>
-        </w:rPr>
-        <w:t xml:space="preserve">1. High Initial Denial Rates: </w:t>
-      </w:r>
-      <w:r>
-        <w:t>Between 10% and 20% of all submitted medical claims are initially denied by commercial and government health plans, representing over $260 billion in at-risk annual hospital revenue.</w:t>
-        <w:br/>
-      </w:r>
-      <w:r>
-        <w:rPr>
-          <w:b/>
-        </w:rPr>
-        <w:t xml:space="preserve">2. Manual, Labor-Intensive Follow-Up: </w:t>
-      </w:r>
-      <w:r>
-        <w:t>Traditional revenue cycle management (RCM) billing departments rely on manual call lists, static spreadsheets, and first-in-first-out (FIFO) work queues, leading to massive backlogs where billers spend 20-30 minutes per claim waiting on hold with payer call centers.</w:t>
-        <w:br/>
-      </w:r>
-      <w:r>
-        <w:rPr>
-          <w:b/>
-        </w:rPr>
-        <w:t xml:space="preserve">3. Rigid Timely Filing Expirations: </w:t>
-      </w:r>
-      <w:r>
-        <w:t>Payers enforce strict timely filing limits (e.g., 60 to 180 days). If an appeal or resubmission is not filed with the required clinical documentation before this deadline, the provider legally forfeits 100% of the revenue.</w:t>
-        <w:br/>
-      </w:r>
-      <w:r>
-        <w:rPr>
-          <w:b/>
-        </w:rPr>
-        <w:t xml:space="preserve">4. Opaque, Complex Payer Rules: </w:t>
-      </w:r>
-      <w:r>
-        <w:t>Each health plan (Aetna, BlueCross, UnitedHealthcare, Medicare, Medicaid) maintains hundreds of pages of evolving clinical policies, prior authorization guidelines, and dispute submission rules that human billers cannot memorize or cross-reference quickly.</w:t>
-      </w:r>
-    </w:p>
-    <w:p>
-      <w:pPr>
-        <w:pStyle w:val="Heading2"/>
-      </w:pPr>
-      <w:r>
-        <w:t>1.2 The RecoverAI Solution</w:t>
-      </w:r>
-    </w:p>
-    <w:p>
-      <w:r>
-        <w:t>RecoverAI is an autonomous, end-to-end revenue cycle AI platform that replaces passive, manual follow-up queues with an intelligent, closed-loop recovery engine. RecoverAI ingests claims, evaluates risk and delay probabilities using gradient-boosted machine learning, retrieves relevant contractual rules via a Vector RAG knowledge engine, formulates high-confidence dispute actions via an autonomous AI agent, drafts formal appeal documentation, simulates realistic payer adjudication, and commits recoveries directly to the financial ledger.</w:t>
-      </w:r>
-    </w:p>
-    <w:p>
-      <w:pPr>
-        <w:pStyle w:val="Heading1"/>
-      </w:pPr>
-      <w:r>
-        <w:t>2. High-Level System Architecture &amp; Technical Stack</w:t>
-      </w:r>
-    </w:p>
-    <w:p>
-      <w:r>
-        <w:t>RecoverAI is designed with a lightweight, high-performance, modular architecture that operates entirely locally without external cloud dependencies or complex distributed infrastructure.</w:t>
+        <w:t>RecoverAI deploys dual Scikit-Learn gradient boosting models alongside a transparent multi-variable prioritization engine.</w:t>
       </w:r>
     </w:p>
     <w:tbl>
@@ -183,22 +654,30 @@
         <w:tblW w:type="auto" w:w="0"/>
         <w:jc w:val="center"/>
         <w:tblLook w:firstColumn="1" w:firstRow="1" w:lastColumn="0" w:lastRow="0" w:noHBand="0" w:noVBand="1" w:val="04A0"/>
+        <w:tblBorders>
+          <w:top w:val="single" w:sz="4" w:space="0" w:color="CBD5E1"/>
+          <w:bottom w:val="single" w:sz="4" w:space="0" w:color="CBD5E1"/>
+          <w:left w:val="none"/>
+          <w:right w:val="none"/>
+          <w:insideH w:val="single" w:sz="4" w:space="0" w:color="CBD5E1"/>
+          <w:insideV w:val="none"/>
+        </w:tblBorders>
       </w:tblPr>
       <w:tblGrid>
-        <w:gridCol w:w="3312"/>
-        <w:gridCol w:w="3312"/>
-        <w:gridCol w:w="3312"/>
+        <w:gridCol w:w="3120"/>
+        <w:gridCol w:w="3120"/>
+        <w:gridCol w:w="3120"/>
       </w:tblGrid>
       <w:tr>
         <w:tc>
           <w:tcPr>
-            <w:tcW w:type="dxa" w:w="3312"/>
-            <w:shd w:fill="0B2545"/>
+            <w:tcW w:type="dxa" w:w="3120"/>
+            <w:shd w:fill="1E3A8A"/>
             <w:tcMar>
-              <w:top w:w="120" w:type="dxa"/>
-              <w:bottom w:w="120" w:type="dxa"/>
-              <w:left w:w="140" w:type="dxa"/>
-              <w:right w:w="140" w:type="dxa"/>
+              <w:top w:w="140" w:type="dxa"/>
+              <w:bottom w:w="140" w:type="dxa"/>
+              <w:left w:w="160" w:type="dxa"/>
+              <w:right w:w="160" w:type="dxa"/>
             </w:tcMar>
           </w:tcPr>
           <w:p>
@@ -209,21 +688,21 @@
               <w:rPr>
                 <w:b/>
                 <w:color w:val="FFFFFF"/>
-                <w:sz w:val="19"/>
+                <w:sz w:val="20"/>
               </w:rPr>
-              <w:t>Layer / Component</w:t>
+              <w:t>Model Metric / Attribute</w:t>
             </w:r>
           </w:p>
         </w:tc>
         <w:tc>
           <w:tcPr>
-            <w:tcW w:type="dxa" w:w="3312"/>
-            <w:shd w:fill="0B2545"/>
+            <w:tcW w:type="dxa" w:w="3120"/>
+            <w:shd w:fill="1E3A8A"/>
             <w:tcMar>
-              <w:top w:w="120" w:type="dxa"/>
-              <w:bottom w:w="120" w:type="dxa"/>
-              <w:left w:w="140" w:type="dxa"/>
-              <w:right w:w="140" w:type="dxa"/>
+              <w:top w:w="140" w:type="dxa"/>
+              <w:bottom w:w="140" w:type="dxa"/>
+              <w:left w:w="160" w:type="dxa"/>
+              <w:right w:w="160" w:type="dxa"/>
             </w:tcMar>
           </w:tcPr>
           <w:p>
@@ -234,21 +713,21 @@
               <w:rPr>
                 <w:b/>
                 <w:color w:val="FFFFFF"/>
-                <w:sz w:val="19"/>
+                <w:sz w:val="20"/>
               </w:rPr>
-              <w:t>Technology Stack</w:t>
+              <w:t>Adjudication Delay Classifier</w:t>
             </w:r>
           </w:p>
         </w:tc>
         <w:tc>
           <w:tcPr>
-            <w:tcW w:type="dxa" w:w="3312"/>
-            <w:shd w:fill="0B2545"/>
+            <w:tcW w:type="dxa" w:w="3120"/>
+            <w:shd w:fill="1E3A8A"/>
             <w:tcMar>
-              <w:top w:w="120" w:type="dxa"/>
-              <w:bottom w:w="120" w:type="dxa"/>
-              <w:left w:w="140" w:type="dxa"/>
-              <w:right w:w="140" w:type="dxa"/>
+              <w:top w:w="140" w:type="dxa"/>
+              <w:bottom w:w="140" w:type="dxa"/>
+              <w:left w:w="160" w:type="dxa"/>
+              <w:right w:w="160" w:type="dxa"/>
             </w:tcMar>
           </w:tcPr>
           <w:p>
@@ -259,9 +738,9 @@
               <w:rPr>
                 <w:b/>
                 <w:color w:val="FFFFFF"/>
-                <w:sz w:val="19"/>
+                <w:sz w:val="20"/>
               </w:rPr>
-              <w:t>Core Responsibility</w:t>
+              <w:t>Claim Denial Risk Classifier</w:t>
             </w:r>
           </w:p>
         </w:tc>
@@ -269,73 +748,73 @@
       <w:tr>
         <w:tc>
           <w:tcPr>
-            <w:tcW w:type="dxa" w:w="3312"/>
-            <w:shd w:fill="FFFFFF"/>
+            <w:tcW w:type="dxa" w:w="3120"/>
+            <w:shd w:fill="F8FAFC"/>
             <w:tcMar>
-              <w:top w:w="80" w:type="dxa"/>
-              <w:bottom w:w="80" w:type="dxa"/>
-              <w:left w:w="120" w:type="dxa"/>
-              <w:right w:w="120" w:type="dxa"/>
+              <w:top w:w="100" w:type="dxa"/>
+              <w:bottom w:w="100" w:type="dxa"/>
+              <w:left w:w="160" w:type="dxa"/>
+              <w:right w:w="160" w:type="dxa"/>
             </w:tcMar>
           </w:tcPr>
           <w:p>
             <w:pPr>
-              <w:spacing w:before="20" w:after="20"/>
+              <w:spacing w:before="40" w:after="40"/>
             </w:pPr>
             <w:r>
               <w:rPr>
-                <w:color w:val="1E293B"/>
-                <w:sz w:val="18"/>
+                <w:color w:val="1F2937"/>
+                <w:sz w:val="19"/>
               </w:rPr>
-              <w:t>Database Layer</w:t>
+              <w:t>Target Variable</w:t>
             </w:r>
           </w:p>
         </w:tc>
         <w:tc>
           <w:tcPr>
-            <w:tcW w:type="dxa" w:w="3312"/>
-            <w:shd w:fill="FFFFFF"/>
+            <w:tcW w:type="dxa" w:w="3120"/>
+            <w:shd w:fill="F8FAFC"/>
             <w:tcMar>
-              <w:top w:w="80" w:type="dxa"/>
-              <w:bottom w:w="80" w:type="dxa"/>
-              <w:left w:w="120" w:type="dxa"/>
-              <w:right w:w="120" w:type="dxa"/>
+              <w:top w:w="100" w:type="dxa"/>
+              <w:bottom w:w="100" w:type="dxa"/>
+              <w:left w:w="160" w:type="dxa"/>
+              <w:right w:w="160" w:type="dxa"/>
             </w:tcMar>
           </w:tcPr>
           <w:p>
             <w:pPr>
-              <w:spacing w:before="20" w:after="20"/>
+              <w:spacing w:before="40" w:after="40"/>
             </w:pPr>
             <w:r>
               <w:rPr>
-                <w:color w:val="1E293B"/>
-                <w:sz w:val="18"/>
+                <w:color w:val="1F2937"/>
+                <w:sz w:val="19"/>
               </w:rPr>
-              <w:t>SQLite (`ar_followup.db`) + SQLAlchemy ORM</w:t>
+              <w:t>was_delayed (Binary: 0 or 1)</w:t>
             </w:r>
           </w:p>
         </w:tc>
         <w:tc>
           <w:tcPr>
-            <w:tcW w:type="dxa" w:w="3312"/>
-            <w:shd w:fill="FFFFFF"/>
+            <w:tcW w:type="dxa" w:w="3120"/>
+            <w:shd w:fill="F8FAFC"/>
             <w:tcMar>
-              <w:top w:w="80" w:type="dxa"/>
-              <w:bottom w:w="80" w:type="dxa"/>
-              <w:left w:w="120" w:type="dxa"/>
-              <w:right w:w="120" w:type="dxa"/>
+              <w:top w:w="100" w:type="dxa"/>
+              <w:bottom w:w="100" w:type="dxa"/>
+              <w:left w:w="160" w:type="dxa"/>
+              <w:right w:w="160" w:type="dxa"/>
             </w:tcMar>
           </w:tcPr>
           <w:p>
             <w:pPr>
-              <w:spacing w:before="20" w:after="20"/>
+              <w:spacing w:before="40" w:after="40"/>
             </w:pPr>
             <w:r>
               <w:rPr>
-                <w:color w:val="1E293B"/>
-                <w:sz w:val="18"/>
+                <w:color w:val="1F2937"/>
+                <w:sz w:val="19"/>
               </w:rPr>
-              <w:t>Manages 30,000+ relational rows: claims, payers, policies, follow-up audit logs, and outcomes.</w:t>
+              <w:t>was_denied (Binary: 0 or 1)</w:t>
             </w:r>
           </w:p>
         </w:tc>
@@ -343,73 +822,73 @@
       <w:tr>
         <w:tc>
           <w:tcPr>
-            <w:tcW w:type="dxa" w:w="3312"/>
-            <w:shd w:fill="F8FAFC"/>
+            <w:tcW w:type="dxa" w:w="3120"/>
+            <w:shd w:fill="FFFFFF"/>
             <w:tcMar>
-              <w:top w:w="80" w:type="dxa"/>
-              <w:bottom w:w="80" w:type="dxa"/>
-              <w:left w:w="120" w:type="dxa"/>
-              <w:right w:w="120" w:type="dxa"/>
+              <w:top w:w="100" w:type="dxa"/>
+              <w:bottom w:w="100" w:type="dxa"/>
+              <w:left w:w="160" w:type="dxa"/>
+              <w:right w:w="160" w:type="dxa"/>
             </w:tcMar>
           </w:tcPr>
           <w:p>
             <w:pPr>
-              <w:spacing w:before="20" w:after="20"/>
+              <w:spacing w:before="40" w:after="40"/>
             </w:pPr>
             <w:r>
               <w:rPr>
-                <w:color w:val="1E293B"/>
-                <w:sz w:val="18"/>
+                <w:color w:val="1F2937"/>
+                <w:sz w:val="19"/>
               </w:rPr>
-              <w:t>ML Intelligence Layer</w:t>
+              <w:t>Algorithm</w:t>
             </w:r>
           </w:p>
         </w:tc>
         <w:tc>
           <w:tcPr>
-            <w:tcW w:type="dxa" w:w="3312"/>
-            <w:shd w:fill="F8FAFC"/>
+            <w:tcW w:type="dxa" w:w="3120"/>
+            <w:shd w:fill="FFFFFF"/>
             <w:tcMar>
-              <w:top w:w="80" w:type="dxa"/>
-              <w:bottom w:w="80" w:type="dxa"/>
-              <w:left w:w="120" w:type="dxa"/>
-              <w:right w:w="120" w:type="dxa"/>
+              <w:top w:w="100" w:type="dxa"/>
+              <w:bottom w:w="100" w:type="dxa"/>
+              <w:left w:w="160" w:type="dxa"/>
+              <w:right w:w="160" w:type="dxa"/>
             </w:tcMar>
           </w:tcPr>
           <w:p>
             <w:pPr>
-              <w:spacing w:before="20" w:after="20"/>
+              <w:spacing w:before="40" w:after="40"/>
             </w:pPr>
             <w:r>
               <w:rPr>
-                <w:color w:val="1E293B"/>
-                <w:sz w:val="18"/>
+                <w:color w:val="1F2937"/>
+                <w:sz w:val="19"/>
               </w:rPr>
-              <w:t>Scikit-Learn (HistGradientBoosting) + Joblib + Pandas</w:t>
+              <w:t>HistGradientBoostingClassifier</w:t>
             </w:r>
           </w:p>
         </w:tc>
         <w:tc>
           <w:tcPr>
-            <w:tcW w:type="dxa" w:w="3312"/>
-            <w:shd w:fill="F8FAFC"/>
+            <w:tcW w:type="dxa" w:w="3120"/>
+            <w:shd w:fill="FFFFFF"/>
             <w:tcMar>
-              <w:top w:w="80" w:type="dxa"/>
-              <w:bottom w:w="80" w:type="dxa"/>
-              <w:left w:w="120" w:type="dxa"/>
-              <w:right w:w="120" w:type="dxa"/>
+              <w:top w:w="100" w:type="dxa"/>
+              <w:bottom w:w="100" w:type="dxa"/>
+              <w:left w:w="160" w:type="dxa"/>
+              <w:right w:w="160" w:type="dxa"/>
             </w:tcMar>
           </w:tcPr>
           <w:p>
             <w:pPr>
-              <w:spacing w:before="20" w:after="20"/>
+              <w:spacing w:before="40" w:after="40"/>
             </w:pPr>
             <w:r>
               <w:rPr>
-                <w:color w:val="1E293B"/>
-                <w:sz w:val="18"/>
+                <w:color w:val="1F2937"/>
+                <w:sz w:val="19"/>
               </w:rPr>
-              <w:t>Computes real-time P(Delay), P(Denial), P(Recovery), and expected dollar yield on 24 multi-modal features.</w:t>
+              <w:t>HistGradientBoostingClassifier</w:t>
             </w:r>
           </w:p>
         </w:tc>
@@ -417,73 +896,73 @@
       <w:tr>
         <w:tc>
           <w:tcPr>
-            <w:tcW w:type="dxa" w:w="3312"/>
-            <w:shd w:fill="FFFFFF"/>
+            <w:tcW w:type="dxa" w:w="3120"/>
+            <w:shd w:fill="F8FAFC"/>
             <w:tcMar>
-              <w:top w:w="80" w:type="dxa"/>
-              <w:bottom w:w="80" w:type="dxa"/>
-              <w:left w:w="120" w:type="dxa"/>
-              <w:right w:w="120" w:type="dxa"/>
+              <w:top w:w="100" w:type="dxa"/>
+              <w:bottom w:w="100" w:type="dxa"/>
+              <w:left w:w="160" w:type="dxa"/>
+              <w:right w:w="160" w:type="dxa"/>
             </w:tcMar>
           </w:tcPr>
           <w:p>
             <w:pPr>
-              <w:spacing w:before="20" w:after="20"/>
+              <w:spacing w:before="40" w:after="40"/>
             </w:pPr>
             <w:r>
               <w:rPr>
-                <w:color w:val="1E293B"/>
-                <w:sz w:val="18"/>
+                <w:color w:val="1F2937"/>
+                <w:sz w:val="19"/>
               </w:rPr>
-              <w:t>Priority Engine</w:t>
+              <w:t>ROC-AUC Score</w:t>
             </w:r>
           </w:p>
         </w:tc>
         <w:tc>
           <w:tcPr>
-            <w:tcW w:type="dxa" w:w="3312"/>
-            <w:shd w:fill="FFFFFF"/>
+            <w:tcW w:type="dxa" w:w="3120"/>
+            <w:shd w:fill="F8FAFC"/>
             <w:tcMar>
-              <w:top w:w="80" w:type="dxa"/>
-              <w:bottom w:w="80" w:type="dxa"/>
-              <w:left w:w="120" w:type="dxa"/>
-              <w:right w:w="120" w:type="dxa"/>
+              <w:top w:w="100" w:type="dxa"/>
+              <w:bottom w:w="100" w:type="dxa"/>
+              <w:left w:w="160" w:type="dxa"/>
+              <w:right w:w="160" w:type="dxa"/>
             </w:tcMar>
           </w:tcPr>
           <w:p>
             <w:pPr>
-              <w:spacing w:before="20" w:after="20"/>
+              <w:spacing w:before="40" w:after="40"/>
             </w:pPr>
             <w:r>
               <w:rPr>
-                <w:color w:val="1E293B"/>
-                <w:sz w:val="18"/>
+                <w:color w:val="1F2937"/>
+                <w:sz w:val="19"/>
               </w:rPr>
-              <w:t>Multi-modal Python prioritization service</w:t>
+              <w:t>0.7462</w:t>
             </w:r>
           </w:p>
         </w:tc>
         <w:tc>
           <w:tcPr>
-            <w:tcW w:type="dxa" w:w="3312"/>
-            <w:shd w:fill="FFFFFF"/>
+            <w:tcW w:type="dxa" w:w="3120"/>
+            <w:shd w:fill="F8FAFC"/>
             <w:tcMar>
-              <w:top w:w="80" w:type="dxa"/>
-              <w:bottom w:w="80" w:type="dxa"/>
-              <w:left w:w="120" w:type="dxa"/>
-              <w:right w:w="120" w:type="dxa"/>
+              <w:top w:w="100" w:type="dxa"/>
+              <w:bottom w:w="100" w:type="dxa"/>
+              <w:left w:w="160" w:type="dxa"/>
+              <w:right w:w="160" w:type="dxa"/>
             </w:tcMar>
           </w:tcPr>
           <w:p>
             <w:pPr>
-              <w:spacing w:before="20" w:after="20"/>
+              <w:spacing w:before="40" w:after="40"/>
             </w:pPr>
             <w:r>
               <w:rPr>
-                <w:color w:val="1E293B"/>
-                <w:sz w:val="18"/>
+                <w:color w:val="1F2937"/>
+                <w:sz w:val="19"/>
               </w:rPr>
-              <w:t>Calculates composite priority score (0-100), assigns priority bands, and outputs explainability factors.</w:t>
+              <w:t>0.7818</w:t>
             </w:r>
           </w:p>
         </w:tc>
@@ -491,73 +970,73 @@
       <w:tr>
         <w:tc>
           <w:tcPr>
-            <w:tcW w:type="dxa" w:w="3312"/>
-            <w:shd w:fill="F8FAFC"/>
+            <w:tcW w:type="dxa" w:w="3120"/>
+            <w:shd w:fill="FFFFFF"/>
             <w:tcMar>
-              <w:top w:w="80" w:type="dxa"/>
-              <w:bottom w:w="80" w:type="dxa"/>
-              <w:left w:w="120" w:type="dxa"/>
-              <w:right w:w="120" w:type="dxa"/>
+              <w:top w:w="100" w:type="dxa"/>
+              <w:bottom w:w="100" w:type="dxa"/>
+              <w:left w:w="160" w:type="dxa"/>
+              <w:right w:w="160" w:type="dxa"/>
             </w:tcMar>
           </w:tcPr>
           <w:p>
             <w:pPr>
-              <w:spacing w:before="20" w:after="20"/>
+              <w:spacing w:before="40" w:after="40"/>
             </w:pPr>
             <w:r>
               <w:rPr>
-                <w:color w:val="1E293B"/>
-                <w:sz w:val="18"/>
+                <w:color w:val="1F2937"/>
+                <w:sz w:val="19"/>
               </w:rPr>
-              <w:t>RAG Knowledge Engine</w:t>
+              <w:t>Accuracy</w:t>
             </w:r>
           </w:p>
         </w:tc>
         <w:tc>
           <w:tcPr>
-            <w:tcW w:type="dxa" w:w="3312"/>
-            <w:shd w:fill="F8FAFC"/>
+            <w:tcW w:type="dxa" w:w="3120"/>
+            <w:shd w:fill="FFFFFF"/>
             <w:tcMar>
-              <w:top w:w="80" w:type="dxa"/>
-              <w:bottom w:w="80" w:type="dxa"/>
-              <w:left w:w="120" w:type="dxa"/>
-              <w:right w:w="120" w:type="dxa"/>
+              <w:top w:w="100" w:type="dxa"/>
+              <w:bottom w:w="100" w:type="dxa"/>
+              <w:left w:w="160" w:type="dxa"/>
+              <w:right w:w="160" w:type="dxa"/>
             </w:tcMar>
           </w:tcPr>
           <w:p>
             <w:pPr>
-              <w:spacing w:before="20" w:after="20"/>
+              <w:spacing w:before="40" w:after="40"/>
             </w:pPr>
             <w:r>
               <w:rPr>
-                <w:color w:val="1E293B"/>
-                <w:sz w:val="18"/>
+                <w:color w:val="1F2937"/>
+                <w:sz w:val="19"/>
               </w:rPr>
-              <w:t>In-Memory TF-IDF Vector Store + Cosine Similarity</w:t>
+              <w:t>79.20%</w:t>
             </w:r>
           </w:p>
         </w:tc>
         <w:tc>
           <w:tcPr>
-            <w:tcW w:type="dxa" w:w="3312"/>
-            <w:shd w:fill="F8FAFC"/>
+            <w:tcW w:type="dxa" w:w="3120"/>
+            <w:shd w:fill="FFFFFF"/>
             <w:tcMar>
-              <w:top w:w="80" w:type="dxa"/>
-              <w:bottom w:w="80" w:type="dxa"/>
-              <w:left w:w="120" w:type="dxa"/>
-              <w:right w:w="120" w:type="dxa"/>
+              <w:top w:w="100" w:type="dxa"/>
+              <w:bottom w:w="100" w:type="dxa"/>
+              <w:left w:w="160" w:type="dxa"/>
+              <w:right w:w="160" w:type="dxa"/>
             </w:tcMar>
           </w:tcPr>
           <w:p>
             <w:pPr>
-              <w:spacing w:before="20" w:after="20"/>
+              <w:spacing w:before="40" w:after="40"/>
             </w:pPr>
             <w:r>
               <w:rPr>
-                <w:color w:val="1E293B"/>
-                <w:sz w:val="18"/>
+                <w:color w:val="1F2937"/>
+                <w:sz w:val="19"/>
               </w:rPr>
-              <w:t>Semantic search over 40 structured policy chunks across 10 payers; extracts rules &amp; required document checklists.</w:t>
+              <w:t>82.00%</w:t>
             </w:r>
           </w:p>
         </w:tc>
@@ -565,73 +1044,73 @@
       <w:tr>
         <w:tc>
           <w:tcPr>
-            <w:tcW w:type="dxa" w:w="3312"/>
-            <w:shd w:fill="FFFFFF"/>
+            <w:tcW w:type="dxa" w:w="3120"/>
+            <w:shd w:fill="F8FAFC"/>
             <w:tcMar>
-              <w:top w:w="80" w:type="dxa"/>
-              <w:bottom w:w="80" w:type="dxa"/>
-              <w:left w:w="120" w:type="dxa"/>
-              <w:right w:w="120" w:type="dxa"/>
+              <w:top w:w="100" w:type="dxa"/>
+              <w:bottom w:w="100" w:type="dxa"/>
+              <w:left w:w="160" w:type="dxa"/>
+              <w:right w:w="160" w:type="dxa"/>
             </w:tcMar>
           </w:tcPr>
           <w:p>
             <w:pPr>
-              <w:spacing w:before="20" w:after="20"/>
+              <w:spacing w:before="40" w:after="40"/>
             </w:pPr>
             <w:r>
               <w:rPr>
-                <w:color w:val="1E293B"/>
-                <w:sz w:val="18"/>
+                <w:color w:val="1F2937"/>
+                <w:sz w:val="19"/>
               </w:rPr>
-              <w:t>Autonomous AI Agent</w:t>
+              <w:t>Precision</w:t>
             </w:r>
           </w:p>
         </w:tc>
         <w:tc>
           <w:tcPr>
-            <w:tcW w:type="dxa" w:w="3312"/>
-            <w:shd w:fill="FFFFFF"/>
+            <w:tcW w:type="dxa" w:w="3120"/>
+            <w:shd w:fill="F8FAFC"/>
             <w:tcMar>
-              <w:top w:w="80" w:type="dxa"/>
-              <w:bottom w:w="80" w:type="dxa"/>
-              <w:left w:w="120" w:type="dxa"/>
-              <w:right w:w="120" w:type="dxa"/>
+              <w:top w:w="100" w:type="dxa"/>
+              <w:bottom w:w="100" w:type="dxa"/>
+              <w:left w:w="160" w:type="dxa"/>
+              <w:right w:w="160" w:type="dxa"/>
             </w:tcMar>
           </w:tcPr>
           <w:p>
             <w:pPr>
-              <w:spacing w:before="20" w:after="20"/>
+              <w:spacing w:before="40" w:after="40"/>
             </w:pPr>
             <w:r>
               <w:rPr>
-                <w:color w:val="1E293B"/>
-                <w:sz w:val="18"/>
+                <w:color w:val="1F2937"/>
+                <w:sz w:val="19"/>
               </w:rPr>
-              <w:t>Deterministic Agentic Decision Engine</w:t>
+              <w:t>82.07%</w:t>
             </w:r>
           </w:p>
         </w:tc>
         <w:tc>
           <w:tcPr>
-            <w:tcW w:type="dxa" w:w="3312"/>
-            <w:shd w:fill="FFFFFF"/>
+            <w:tcW w:type="dxa" w:w="3120"/>
+            <w:shd w:fill="F8FAFC"/>
             <w:tcMar>
-              <w:top w:w="80" w:type="dxa"/>
-              <w:bottom w:w="80" w:type="dxa"/>
-              <w:left w:w="120" w:type="dxa"/>
-              <w:right w:w="120" w:type="dxa"/>
+              <w:top w:w="100" w:type="dxa"/>
+              <w:bottom w:w="100" w:type="dxa"/>
+              <w:left w:w="160" w:type="dxa"/>
+              <w:right w:w="160" w:type="dxa"/>
             </w:tcMar>
           </w:tcPr>
           <w:p>
             <w:pPr>
-              <w:spacing w:before="20" w:after="20"/>
+              <w:spacing w:before="40" w:after="40"/>
             </w:pPr>
             <w:r>
               <w:rPr>
-                <w:color w:val="1E293B"/>
-                <w:sz w:val="18"/>
+                <w:color w:val="1F2937"/>
+                <w:sz w:val="19"/>
               </w:rPr>
-              <w:t>Intakes claim state, evaluates deadline proximity, selects optimal action &amp; channel, and drafts appeal rationale.</w:t>
+              <w:t>68.06%</w:t>
             </w:r>
           </w:p>
         </w:tc>
@@ -639,73 +1118,73 @@
       <w:tr>
         <w:tc>
           <w:tcPr>
-            <w:tcW w:type="dxa" w:w="3312"/>
-            <w:shd w:fill="F8FAFC"/>
+            <w:tcW w:type="dxa" w:w="3120"/>
+            <w:shd w:fill="FFFFFF"/>
             <w:tcMar>
-              <w:top w:w="80" w:type="dxa"/>
-              <w:bottom w:w="80" w:type="dxa"/>
-              <w:left w:w="120" w:type="dxa"/>
-              <w:right w:w="120" w:type="dxa"/>
+              <w:top w:w="100" w:type="dxa"/>
+              <w:bottom w:w="100" w:type="dxa"/>
+              <w:left w:w="160" w:type="dxa"/>
+              <w:right w:w="160" w:type="dxa"/>
             </w:tcMar>
           </w:tcPr>
           <w:p>
             <w:pPr>
-              <w:spacing w:before="20" w:after="20"/>
+              <w:spacing w:before="40" w:after="40"/>
             </w:pPr>
             <w:r>
               <w:rPr>
-                <w:color w:val="1E293B"/>
-                <w:sz w:val="18"/>
+                <w:color w:val="1F2937"/>
+                <w:sz w:val="19"/>
               </w:rPr>
-              <w:t>Follow-Up Generator</w:t>
+              <w:t>Recall (Sensitivity)</w:t>
             </w:r>
           </w:p>
         </w:tc>
         <w:tc>
           <w:tcPr>
-            <w:tcW w:type="dxa" w:w="3312"/>
-            <w:shd w:fill="F8FAFC"/>
+            <w:tcW w:type="dxa" w:w="3120"/>
+            <w:shd w:fill="FFFFFF"/>
             <w:tcMar>
-              <w:top w:w="80" w:type="dxa"/>
-              <w:bottom w:w="80" w:type="dxa"/>
-              <w:left w:w="120" w:type="dxa"/>
-              <w:right w:w="120" w:type="dxa"/>
+              <w:top w:w="100" w:type="dxa"/>
+              <w:bottom w:w="100" w:type="dxa"/>
+              <w:left w:w="160" w:type="dxa"/>
+              <w:right w:w="160" w:type="dxa"/>
             </w:tcMar>
           </w:tcPr>
           <w:p>
             <w:pPr>
-              <w:spacing w:before="20" w:after="20"/>
+              <w:spacing w:before="40" w:after="40"/>
             </w:pPr>
             <w:r>
               <w:rPr>
-                <w:color w:val="1E293B"/>
-                <w:sz w:val="18"/>
+                <w:color w:val="1F2937"/>
+                <w:sz w:val="19"/>
               </w:rPr>
-              <w:t>Multi-Format Template Compilation Studio</w:t>
+              <w:t>93.05%</w:t>
             </w:r>
           </w:p>
         </w:tc>
         <w:tc>
           <w:tcPr>
-            <w:tcW w:type="dxa" w:w="3312"/>
-            <w:shd w:fill="F8FAFC"/>
+            <w:tcW w:type="dxa" w:w="3120"/>
+            <w:shd w:fill="FFFFFF"/>
             <w:tcMar>
-              <w:top w:w="80" w:type="dxa"/>
-              <w:bottom w:w="80" w:type="dxa"/>
-              <w:left w:w="120" w:type="dxa"/>
-              <w:right w:w="120" w:type="dxa"/>
+              <w:top w:w="100" w:type="dxa"/>
+              <w:bottom w:w="100" w:type="dxa"/>
+              <w:left w:w="160" w:type="dxa"/>
+              <w:right w:w="160" w:type="dxa"/>
             </w:tcMar>
           </w:tcPr>
           <w:p>
             <w:pPr>
-              <w:spacing w:before="20" w:after="20"/>
+              <w:spacing w:before="40" w:after="40"/>
             </w:pPr>
             <w:r>
               <w:rPr>
-                <w:color w:val="1E293B"/>
-                <w:sz w:val="18"/>
+                <w:color w:val="1F2937"/>
+                <w:sz w:val="19"/>
               </w:rPr>
-              <w:t>Synthesizes formal CMS-1500/UB-04 appeals, portal inquiries, phone dialogue scripts, emails, and EDI 837 notes.</w:t>
+              <w:t>54.64%</w:t>
             </w:r>
           </w:p>
         </w:tc>
@@ -713,73 +1192,193 @@
       <w:tr>
         <w:tc>
           <w:tcPr>
-            <w:tcW w:type="dxa" w:w="3312"/>
-            <w:shd w:fill="FFFFFF"/>
+            <w:tcW w:type="dxa" w:w="3120"/>
+            <w:shd w:fill="F8FAFC"/>
             <w:tcMar>
-              <w:top w:w="80" w:type="dxa"/>
-              <w:bottom w:w="80" w:type="dxa"/>
-              <w:left w:w="120" w:type="dxa"/>
-              <w:right w:w="120" w:type="dxa"/>
+              <w:top w:w="100" w:type="dxa"/>
+              <w:bottom w:w="100" w:type="dxa"/>
+              <w:left w:w="160" w:type="dxa"/>
+              <w:right w:w="160" w:type="dxa"/>
             </w:tcMar>
           </w:tcPr>
           <w:p>
             <w:pPr>
-              <w:spacing w:before="20" w:after="20"/>
+              <w:spacing w:before="40" w:after="40"/>
             </w:pPr>
             <w:r>
               <w:rPr>
-                <w:color w:val="1E293B"/>
-                <w:sz w:val="18"/>
+                <w:color w:val="1F2937"/>
+                <w:sz w:val="19"/>
               </w:rPr>
-              <w:t>Payer Simulator &amp; Loop</w:t>
+              <w:t>F1-Score</w:t>
             </w:r>
           </w:p>
         </w:tc>
         <w:tc>
           <w:tcPr>
-            <w:tcW w:type="dxa" w:w="3312"/>
-            <w:shd w:fill="FFFFFF"/>
+            <w:tcW w:type="dxa" w:w="3120"/>
+            <w:shd w:fill="F8FAFC"/>
             <w:tcMar>
-              <w:top w:w="80" w:type="dxa"/>
-              <w:bottom w:w="80" w:type="dxa"/>
-              <w:left w:w="120" w:type="dxa"/>
-              <w:right w:w="120" w:type="dxa"/>
+              <w:top w:w="100" w:type="dxa"/>
+              <w:bottom w:w="100" w:type="dxa"/>
+              <w:left w:w="160" w:type="dxa"/>
+              <w:right w:w="160" w:type="dxa"/>
             </w:tcMar>
           </w:tcPr>
           <w:p>
             <w:pPr>
-              <w:spacing w:before="20" w:after="20"/>
+              <w:spacing w:before="40" w:after="40"/>
             </w:pPr>
             <w:r>
               <w:rPr>
-                <w:color w:val="1E293B"/>
-                <w:sz w:val="18"/>
+                <w:color w:val="1F2937"/>
+                <w:sz w:val="19"/>
               </w:rPr>
-              <w:t>Probabilistic 4-Class Adjudication Simulator</w:t>
+              <w:t>0.8722</w:t>
             </w:r>
           </w:p>
         </w:tc>
         <w:tc>
           <w:tcPr>
-            <w:tcW w:type="dxa" w:w="3312"/>
-            <w:shd w:fill="FFFFFF"/>
+            <w:tcW w:type="dxa" w:w="3120"/>
+            <w:shd w:fill="F8FAFC"/>
             <w:tcMar>
-              <w:top w:w="80" w:type="dxa"/>
-              <w:bottom w:w="80" w:type="dxa"/>
-              <w:left w:w="120" w:type="dxa"/>
-              <w:right w:w="120" w:type="dxa"/>
+              <w:top w:w="100" w:type="dxa"/>
+              <w:bottom w:w="100" w:type="dxa"/>
+              <w:left w:w="160" w:type="dxa"/>
+              <w:right w:w="160" w:type="dxa"/>
             </w:tcMar>
           </w:tcPr>
           <w:p>
             <w:pPr>
-              <w:spacing w:before="20" w:after="20"/>
+              <w:spacing w:before="40" w:after="40"/>
             </w:pPr>
             <w:r>
               <w:rPr>
-                <w:color w:val="1E293B"/>
-                <w:sz w:val="18"/>
+                <w:color w:val="1F2937"/>
+                <w:sz w:val="19"/>
               </w:rPr>
-              <w:t>Simulates realistic 835 Remittance Advice responses, executes closed-loop recovery cycles, and updates balances.</w:t>
+              <w:t>0.6061</w:t>
+            </w:r>
+          </w:p>
+        </w:tc>
+      </w:tr>
+    </w:tbl>
+    <w:p>
+      <w:pPr>
+        <w:spacing w:after="120"/>
+      </w:pPr>
+    </w:p>
+    <w:p>
+      <w:pPr>
+        <w:pStyle w:val="Heading2"/>
+        <w:spacing w:before="200" w:after="80"/>
+      </w:pPr>
+      <w:r>
+        <w:t>3.1 24-Dimensional Input Feature Vector</w:t>
+      </w:r>
+    </w:p>
+    <w:p>
+      <w:r>
+        <w:t>The models evaluate 24 distinct clinical, financial, and administrative features:</w:t>
+        <w:br/>
+        <w:t>• 13 Numeric Features: days_in_ar, outstanding_amount, billed_amount, allowed_amount, paid_amount, patient_responsibility, expected_reimbursement, followup_count, resubmission_count, days_since_last_response, avg_processing_days, avg_response_days, filing_deadline_days.</w:t>
+        <w:br/>
+        <w:t>• 11 Categorical Features: payer_id, claim_type, place_of_service, claim_status, denial_status, denial_code, denial_reason, authorization_required, authorization_status, network_status, appeal_status.</w:t>
+      </w:r>
+    </w:p>
+    <w:p>
+      <w:pPr>
+        <w:pStyle w:val="Heading2"/>
+        <w:spacing w:before="200" w:after="80"/>
+      </w:pPr>
+      <w:r>
+        <w:t>3.2 Core Prioritization &amp; Financial Yield Formulas</w:t>
+      </w:r>
+    </w:p>
+    <w:tbl>
+      <w:tblPr>
+        <w:tblW w:type="auto" w:w="0"/>
+        <w:jc w:val="center"/>
+        <w:tblLayout w:type="fixed"/>
+        <w:tblLook w:firstColumn="1" w:firstRow="1" w:lastColumn="0" w:lastRow="0" w:noHBand="0" w:noVBand="1" w:val="04A0"/>
+      </w:tblPr>
+      <w:tblGrid>
+        <w:gridCol w:w="9360"/>
+      </w:tblGrid>
+      <w:tr>
+        <w:tc>
+          <w:tcPr>
+            <w:tcW w:type="dxa" w:w="9360"/>
+            <w:shd w:fill="EFF6FF"/>
+            <w:tcMar>
+              <w:top w:w="140" w:type="dxa"/>
+              <w:bottom w:w="140" w:type="dxa"/>
+              <w:left w:w="200" w:type="dxa"/>
+              <w:right w:w="200" w:type="dxa"/>
+            </w:tcMar>
+            <w:tcBorders>
+              <w:top w:val="none"/>
+              <w:bottom w:val="none"/>
+              <w:left w:val="single" w:sz="24" w:space="0" w:color="3B82F6"/>
+              <w:right w:val="none"/>
+            </w:tcBorders>
+          </w:tcPr>
+          <w:p>
+            <w:pPr>
+              <w:spacing w:before="40" w:after="80"/>
+            </w:pPr>
+            <w:r>
+              <w:rPr>
+                <w:b/>
+                <w:color w:val="1E3A8A"/>
+                <w:sz w:val="21"/>
+              </w:rPr>
+              <w:t>📌 Mathematical Formulas for Prioritization &amp; Recovery</w:t>
+              <w:br/>
+            </w:r>
+            <w:r>
+              <w:rPr>
+                <w:color w:val="334155"/>
+                <w:sz w:val="19"/>
+              </w:rPr>
+              <w:t>1. Base Recovery Probability:</w:t>
+              <w:br/>
+              <w:t xml:space="preserve">   Base_Recovery = max(0.05, 1.0 - 0.65 * P(Denial) - 0.15 * P(Delay))</w:t>
+              <w:br/>
+              <w:br/>
+              <w:t>2. Clinical &amp; Aging Adjustments:</w:t>
+              <w:br/>
+              <w:t xml:space="preserve">   • Out-of-Network: Multiply by 0.85</w:t>
+              <w:br/>
+              <w:t xml:space="preserve">   • Prior Authorization Denied: Multiply by 0.60 (Pending: 0.88, Approved: min(0.98, Base * 1.08))</w:t>
+              <w:br/>
+              <w:t xml:space="preserve">   • Appeal Under Review: min(0.95, Base * 1.05)</w:t>
+              <w:br/>
+              <w:t xml:space="preserve">   • AR Aging Decay: If Days &gt; 120 (0.82x); If Days &gt; 90 (0.90x)</w:t>
+              <w:br/>
+              <w:t xml:space="preserve">   • Final P(Recovery) is clamped to [0.05, 0.98]</w:t>
+              <w:br/>
+              <w:br/>
+              <w:t>3. Expected Financial Recovery ($):</w:t>
+              <w:br/>
+              <w:t xml:space="preserve">   Expected_Recovery = Outstanding_Amount * P(Recovery)</w:t>
+              <w:br/>
+              <w:br/>
+              <w:t>4. Priority Score (0 - 100):</w:t>
+              <w:br/>
+              <w:t xml:space="preserve">   Priority_Score = [ 0.45 * P(Recovery) + 0.30 * P(Delay) + 0.25 * min(1.0, Outstanding / $50,000) ] * 100</w:t>
+              <w:br/>
+              <w:br/>
+              <w:t>5. Priority Bands:</w:t>
+              <w:br/>
+              <w:t xml:space="preserve">   • Critical: 85.0 - 100.0 (Immediate expedited appeal)</w:t>
+              <w:br/>
+              <w:t xml:space="preserve">   • High: 70.0 - 84.9 (24-hour follow-up SLA)</w:t>
+              <w:br/>
+              <w:t xml:space="preserve">   • Medium: 40.0 - 69.9 (Routine automated inquiry)</w:t>
+              <w:br/>
+              <w:t xml:space="preserve">   • Low: 0.0 - 39.9 (Batch automated monitoring)</w:t>
             </w:r>
           </w:p>
         </w:tc>
@@ -793,9 +1392,45 @@
     <w:p>
       <w:pPr>
         <w:pStyle w:val="Heading1"/>
+        <w:spacing w:before="280" w:after="120"/>
       </w:pPr>
       <w:r>
-        <w:t>3. In-Depth Component Breakdown &amp; How Each Part Works</w:t>
+        <w:t>4. Retrieval-Augmented Generation (RAG) Architecture</w:t>
+      </w:r>
+    </w:p>
+    <w:p>
+      <w:r>
+        <w:t>In healthcare billing, generative hallucinations lead to legal dismissal of appeals. RecoverAI's vector RAG engine grounds every decision and appeal letter in verified contractual policies.</w:t>
+      </w:r>
+    </w:p>
+    <w:p>
+      <w:r>
+        <w:t>• Corpus: 40 structured policy documents across 10 major commercial and government payers (Aetna, Blue Cross Blue Shield, UnitedHealthcare, Cigna, Humana, Medicare Part A, Medicare Part B, Medicaid State, Kaiser Permanente, Anthem BCBS).</w:t>
+        <w:br/>
+        <w:t>• 4 Specialized Chunks Per Payer:</w:t>
+        <w:br/>
+        <w:t xml:space="preserve">   1. Timely Filing, Adjudication &amp; Escalation Limits (e.g. 90-day submission limit, 15-day processing window).</w:t>
+        <w:br/>
+        <w:t xml:space="preserve">   2. Prior Authorization &amp; Mandatory Clinical Documentation (e.g. operative notes, pre-cert certificates).</w:t>
+        <w:br/>
+        <w:t xml:space="preserve">   3. Appeals, Disputes &amp; Peer-to-Peer Guidelines (e.g. medical necessity disputes, CO-16/CO-50 dispute protocols).</w:t>
+        <w:br/>
+        <w:t xml:space="preserve">   4. Communication Channels &amp; Contact Protocols (e.g. Availity portal, EDI 276/277 transactions, certified mail).</w:t>
+        <w:br/>
+        <w:t>• Vector Index: Scikit-Learn TfidfVectorizer with ngram_range=(1,2) and sublinear term-frequency scaling.</w:t>
+        <w:br/>
+        <w:t>• Payer Metadata Boosting: Inquiries automatically boost matching payer chunks with a +0.15 similarity weight.</w:t>
+        <w:br/>
+        <w:t>• Dynamic Claim Context Retrieval: When drafting an appeal, a targeted query like 'Inpatient denial CO-16 missing documentation appeal' is executed to extract the exact contract paragraphs for citation.</w:t>
+      </w:r>
+    </w:p>
+    <w:p>
+      <w:pPr>
+        <w:pStyle w:val="Heading1"/>
+        <w:spacing w:before="280" w:after="120"/>
+      </w:pPr>
+      <w:r>
+        <w:t>5. Comprehensive Walkthrough of All 10 Frontend Tabs</w:t>
       </w:r>
     </w:p>
     <w:p>
@@ -803,23 +1438,28 @@
         <w:pStyle w:val="Heading2"/>
       </w:pPr>
       <w:r>
-        <w:t>3.1 Data Layer &amp; Production-Scale Synthetic Dataset</w:t>
+        <w:t>5.1 Tab 1: Executive Dashboard (Mission Control)</w:t>
       </w:r>
     </w:p>
     <w:p>
       <w:r>
-        <w:t>To ensure robust evaluation without violating HIPAA privacy regulations, RecoverAI operates on a realistic, statistically grounded synthetic healthcare database containing 30,000+ total records:</w:t>
-      </w:r>
-    </w:p>
-    <w:p>
-      <w:r>
-        <w:t>• 10,000 Hospital Claims: Covers Inpatient ($15k-$80k), Outpatient ($2k-$15k), Emergency ($1k-$12k), and Surgical ($10k-$65k) encounters across 10 payers, totaling $44.05M in outstanding AR.</w:t>
+        <w:t>The executive command center provides real-time financial oversight across the entire hospital AR portfolio:</w:t>
         <w:br/>
-        <w:t>• 10 Distinct Health Plans: Commercial (BlueCross, Aetna, UnitedCare, Cigna, Humana), Government (Medicare Advantage, Medicaid), and Managed Care (Kaiser, Anthem, Molina) with realistic processing times and filing deadlines.</w:t>
+        <w:t>• Total AR Balance: Real-time sum of all outstanding balances across 10,000 claims (~$44.05M).</w:t>
         <w:br/>
-        <w:t>• 40 Structured Policy Knowledge Chunks: Detailed guidelines covering Prior Authorization (CO-197), Missing Documentation (CO-16), Medical Necessity (CO-50), Timely Filing (CO-29), Duplicate Claims (CO-18), and Experimental Exclusions (CO-96).</w:t>
+        <w:t>• Total Claims: 10,000 active hospital records.</w:t>
         <w:br/>
-        <w:t>• 10,000+ Historical Follow-Up Audit Records &amp; Resolution Outcomes: Longitudinal data tracking historical overturn rates, days to resolution, and recovered amounts.</w:t>
+        <w:t>• Critical Priority Claims: Claims scoring &gt;= 85 requiring immediate intervention (~1,200 - 1,400 claims).</w:t>
+        <w:br/>
+        <w:t>• Expected Financial Recovery: Total yield calculated via ML (~$28M - $30M).</w:t>
+        <w:br/>
+        <w:t>• Recovered Revenue: Cumulative cash recovered and ledgered via the autonomous loop.</w:t>
+        <w:br/>
+        <w:t>• Average Days in AR: Mean age of unpaid claims (~52.4 days).</w:t>
+        <w:br/>
+        <w:t>• Denial Rate: Proportion of portfolio claims currently denied (~25.4%).</w:t>
+        <w:br/>
+        <w:t>• Visual Charts: AR Aging Intervals (0-30, 31-60, 61-90, 91-120, 120+ days) vs Expected Recovery; Priority Band Distribution Donut; Top Denial Root Causes (CO-16, CO-50, CO-197); Payer Exposure Table.</w:t>
       </w:r>
     </w:p>
     <w:p>
@@ -827,12 +1467,163 @@
         <w:pStyle w:val="Heading2"/>
       </w:pPr>
       <w:r>
-        <w:t>3.2 Machine Learning Risk &amp; Yield Models</w:t>
+        <w:t>5.2 Tab 2: All Claims (Claim Portfolio Explorer)</w:t>
       </w:r>
     </w:p>
     <w:p>
       <w:r>
-        <w:t>RecoverAI employs two specialized Scikit-Learn Gradient Boosting classifiers trained on 8,000 historical claims and rigorously evaluated on a 2,000-claim holdout test set using 24 multi-modal clinical and financial features:</w:t>
+        <w:t>Interactive claim workspace allowing granular inspection of any claim:</w:t>
+        <w:br/>
+        <w:t>• Multi-Parameter Filters: Search by Claim ID, Patient ID, Provider ID, Denial text; filter by Payer, Status, and Priority Band.</w:t>
+        <w:br/>
+        <w:t>• 4-Tab Slide-Out Detail Modal:</w:t>
+        <w:br/>
+        <w:t xml:space="preserve">   1. AI Strategy Workspace: Visual radial gauges for Delay Risk, Denial Probability, Recovery Potential, and Priority Score; deterministic explainability factor bullet points.</w:t>
+        <w:br/>
+        <w:t xml:space="preserve">   2. Clinical &amp; Financial Ledger: Line-item breakdown of Billed, Allowed, Paid, Patient Responsibility, and Outstanding balances, plus POS, CPT, and ICD-10 codes.</w:t>
+        <w:br/>
+        <w:t xml:space="preserve">   3. Payer Rules &amp; RAG Citations: Active policy paragraphs citing timely filing limits and required documentation.</w:t>
+        <w:br/>
+        <w:t xml:space="preserve">   4. Longitudinal Timeline: Historical audit trail of past follow-up attempts, EDI 276 inquiries, and remittance advice.</w:t>
+      </w:r>
+    </w:p>
+    <w:p>
+      <w:pPr>
+        <w:pStyle w:val="Heading2"/>
+      </w:pPr>
+      <w:r>
+        <w:t>5.3 Tab 3: Priority Worklist (High-Yield Queue)</w:t>
+      </w:r>
+    </w:p>
+    <w:p>
+      <w:r>
+        <w:t>A noise-free operational queue displaying exclusively Critical (85+) and High (70-84.9) priority claims, sorted strictly by expected financial recovery yield.</w:t>
+      </w:r>
+    </w:p>
+    <w:p>
+      <w:pPr>
+        <w:pStyle w:val="Heading2"/>
+      </w:pPr>
+      <w:r>
+        <w:t>5.4 Tab 4: Closed-Loop Engine (Autonomous Batch Recovery)</w:t>
+      </w:r>
+    </w:p>
+    <w:p>
+      <w:r>
+        <w:t>The autonomous execution pipeline that processes claims in unattended batches:</w:t>
+        <w:br/>
+        <w:t>• Controls: Batch Size (10, 20, 30, 50), Minimum Priority Band, Payer Filter, Action Quality.</w:t>
+        <w:br/>
+        <w:t>• 7-Step Cycle: Ingestion -&gt; AI Strategy -&gt; RAG Grounding -&gt; Artifact Synthesis -&gt; Adjudication Simulation -&gt; Database Ledger Update -&gt; Analytics Recomputation.</w:t>
+        <w:br/>
+        <w:t>• Output: Live progress bar, real-time logs, recovery summary banner (Disputed $, Recovered $, Recovery Rate %), and line-item transaction ledger with EFT reference codes.</w:t>
+      </w:r>
+    </w:p>
+    <w:p>
+      <w:pPr>
+        <w:pStyle w:val="Heading2"/>
+      </w:pPr>
+      <w:r>
+        <w:t>5.5 Tab 5: Payer Response Simulator (Adjudication Sandbox)</w:t>
+      </w:r>
+    </w:p>
+    <w:p>
+      <w:r>
+        <w:t>Probabilistic simulation sandbox to model how payers adjudicate follow-up actions:</w:t>
+        <w:br/>
+        <w:t>• Configurable Parameters: Claim selection, Action Type (Appeal, Status Inquiry, Resubmission, Escalation), Channel, Quality.</w:t>
+        <w:br/>
+        <w:t>• 4-Class Probability Output: P(APPROVED_FULL), P(APPROVED_PARTIAL), P(ADDITIONAL_INFO_REQUIRED), P(DENIAL_UPHELD).</w:t>
+        <w:br/>
+        <w:t>• Remittance Generation: Generates ANSI 835 Remittance Advice text, EFT reference numbers (e.g. EFT-UHC-849201), and updates SQLite balances.</w:t>
+      </w:r>
+    </w:p>
+    <w:p>
+      <w:pPr>
+        <w:pStyle w:val="Heading2"/>
+      </w:pPr>
+      <w:r>
+        <w:t>5.6 Tab 6: Multi-Format Generator Studio</w:t>
+      </w:r>
+    </w:p>
+    <w:p>
+      <w:r>
+        <w:t>Generates tailored legal and clinical communication artifacts:</w:t>
+        <w:br/>
+        <w:t>• 5 Supported Formats:</w:t>
+        <w:br/>
+        <w:t xml:space="preserve">   1. Formal CMS-1500 / UB-04 Appeal Letters (complete with grounded policy citations and exhibit checklists).</w:t>
+        <w:br/>
+        <w:t xml:space="preserve">   2. Payer Portal Messages (optimized for Availity, NaviNet, Optum, Change Healthcare).</w:t>
+        <w:br/>
+        <w:t xml:space="preserve">   3. Live Call Scripts (with IVR prompts, verification checkpoints, and Supervisor Escalation Triggers).</w:t>
+        <w:br/>
+        <w:t xml:space="preserve">   4. Secure Provider Email Templates (HIPAA-compliant de-identified summaries).</w:t>
+        <w:br/>
+        <w:t xml:space="preserve">   5. Electronic Resubmission Notes (ANSI 837 replacement notes with modifier -59/-76 explanations).</w:t>
+        <w:br/>
+        <w:t>• Tone Selector: Firm, Urgent, Collaborative; Custom Notes input; One-Click Clipboard Copy.</w:t>
+      </w:r>
+    </w:p>
+    <w:p>
+      <w:pPr>
+        <w:pStyle w:val="Heading2"/>
+      </w:pPr>
+      <w:r>
+        <w:t>5.7 Tab 7: Autonomous AI Agent (Decision Formulation)</w:t>
+      </w:r>
+    </w:p>
+    <w:p>
+      <w:r>
+        <w:t>Single-claim AI reasoning workspace displaying Chain-of-Thought reasoning, confidence scores (85%-95%), urgency rating, and one-click 'Execute &amp; Record in Ledger' button.</w:t>
+      </w:r>
+    </w:p>
+    <w:p>
+      <w:pPr>
+        <w:pStyle w:val="Heading2"/>
+      </w:pPr>
+      <w:r>
+        <w:t>5.8 Tab 8: Payer Policy Knowledge Base (RAG Search)</w:t>
+      </w:r>
+    </w:p>
+    <w:p>
+      <w:r>
+        <w:t>Live semantic search explorer over the 40 policy chunks with similarity score breakdown and metadata filters.</w:t>
+      </w:r>
+    </w:p>
+    <w:p>
+      <w:pPr>
+        <w:pStyle w:val="Heading2"/>
+      </w:pPr>
+      <w:r>
+        <w:t>5.9 Tab 9: ML Model Diagnostics &amp; Benchmarks</w:t>
+      </w:r>
+    </w:p>
+    <w:p>
+      <w:r>
+        <w:t>Technical metrics dashboard displaying ROC-AUC curves, accuracy, precision, recall, F1-scores, and 24-feature schema specifications.</w:t>
+      </w:r>
+    </w:p>
+    <w:p>
+      <w:pPr>
+        <w:pStyle w:val="Heading2"/>
+      </w:pPr>
+      <w:r>
+        <w:t>5.10 Tab 10: System Diagnostics &amp; Health Status</w:t>
+      </w:r>
+    </w:p>
+    <w:p>
+      <w:r>
+        <w:t>System telemetry monitoring FastAPI health status, SQLite database URI, and live counts for 10,000 Claims, 10 Payers, 10 Policies, 10,109 Follow-ups, and 10,000 Outcomes.</w:t>
+      </w:r>
+    </w:p>
+    <w:p>
+      <w:pPr>
+        <w:pStyle w:val="Heading1"/>
+        <w:spacing w:before="280" w:after="120"/>
+      </w:pPr>
+      <w:r>
+        <w:t>6. CARC Denial Codes &amp; Action Matrix Reference</w:t>
       </w:r>
     </w:p>
     <w:tbl>
@@ -840,25 +1631,31 @@
         <w:tblW w:type="auto" w:w="0"/>
         <w:jc w:val="center"/>
         <w:tblLook w:firstColumn="1" w:firstRow="1" w:lastColumn="0" w:lastRow="0" w:noHBand="0" w:noVBand="1" w:val="04A0"/>
+        <w:tblBorders>
+          <w:top w:val="single" w:sz="4" w:space="0" w:color="CBD5E1"/>
+          <w:bottom w:val="single" w:sz="4" w:space="0" w:color="CBD5E1"/>
+          <w:left w:val="none"/>
+          <w:right w:val="none"/>
+          <w:insideH w:val="single" w:sz="4" w:space="0" w:color="CBD5E1"/>
+          <w:insideV w:val="none"/>
+        </w:tblBorders>
       </w:tblPr>
       <w:tblGrid>
-        <w:gridCol w:w="1656"/>
-        <w:gridCol w:w="1656"/>
-        <w:gridCol w:w="1656"/>
-        <w:gridCol w:w="1656"/>
-        <w:gridCol w:w="1656"/>
-        <w:gridCol w:w="1656"/>
+        <w:gridCol w:w="2340"/>
+        <w:gridCol w:w="2340"/>
+        <w:gridCol w:w="2340"/>
+        <w:gridCol w:w="2340"/>
       </w:tblGrid>
       <w:tr>
         <w:tc>
           <w:tcPr>
-            <w:tcW w:type="dxa" w:w="1656"/>
-            <w:shd w:fill="0B2545"/>
+            <w:tcW w:type="dxa" w:w="2340"/>
+            <w:shd w:fill="1E3A8A"/>
             <w:tcMar>
-              <w:top w:w="120" w:type="dxa"/>
-              <w:bottom w:w="120" w:type="dxa"/>
-              <w:left w:w="140" w:type="dxa"/>
-              <w:right w:w="140" w:type="dxa"/>
+              <w:top w:w="140" w:type="dxa"/>
+              <w:bottom w:w="140" w:type="dxa"/>
+              <w:left w:w="160" w:type="dxa"/>
+              <w:right w:w="160" w:type="dxa"/>
             </w:tcMar>
           </w:tcPr>
           <w:p>
@@ -869,21 +1666,21 @@
               <w:rPr>
                 <w:b/>
                 <w:color w:val="FFFFFF"/>
-                <w:sz w:val="19"/>
+                <w:sz w:val="20"/>
               </w:rPr>
-              <w:t>Model Target</w:t>
+              <w:t>CARC Code</w:t>
             </w:r>
           </w:p>
         </w:tc>
         <w:tc>
           <w:tcPr>
-            <w:tcW w:type="dxa" w:w="1656"/>
-            <w:shd w:fill="0B2545"/>
+            <w:tcW w:type="dxa" w:w="2340"/>
+            <w:shd w:fill="1E3A8A"/>
             <w:tcMar>
-              <w:top w:w="120" w:type="dxa"/>
-              <w:bottom w:w="120" w:type="dxa"/>
-              <w:left w:w="140" w:type="dxa"/>
-              <w:right w:w="140" w:type="dxa"/>
+              <w:top w:w="140" w:type="dxa"/>
+              <w:bottom w:w="140" w:type="dxa"/>
+              <w:left w:w="160" w:type="dxa"/>
+              <w:right w:w="160" w:type="dxa"/>
             </w:tcMar>
           </w:tcPr>
           <w:p>
@@ -894,21 +1691,21 @@
               <w:rPr>
                 <w:b/>
                 <w:color w:val="FFFFFF"/>
-                <w:sz w:val="19"/>
+                <w:sz w:val="20"/>
               </w:rPr>
-              <w:t>Algorithm</w:t>
+              <w:t>Description</w:t>
             </w:r>
           </w:p>
         </w:tc>
         <w:tc>
           <w:tcPr>
-            <w:tcW w:type="dxa" w:w="1656"/>
-            <w:shd w:fill="0B2545"/>
+            <w:tcW w:type="dxa" w:w="2340"/>
+            <w:shd w:fill="1E3A8A"/>
             <w:tcMar>
-              <w:top w:w="120" w:type="dxa"/>
-              <w:bottom w:w="120" w:type="dxa"/>
-              <w:left w:w="140" w:type="dxa"/>
-              <w:right w:w="140" w:type="dxa"/>
+              <w:top w:w="140" w:type="dxa"/>
+              <w:bottom w:w="140" w:type="dxa"/>
+              <w:left w:w="160" w:type="dxa"/>
+              <w:right w:w="160" w:type="dxa"/>
             </w:tcMar>
           </w:tcPr>
           <w:p>
@@ -919,21 +1716,21 @@
               <w:rPr>
                 <w:b/>
                 <w:color w:val="FFFFFF"/>
-                <w:sz w:val="19"/>
+                <w:sz w:val="20"/>
               </w:rPr>
-              <w:t>ROC-AUC</w:t>
+              <w:t>AI Agent Action</w:t>
             </w:r>
           </w:p>
         </w:tc>
         <w:tc>
           <w:tcPr>
-            <w:tcW w:type="dxa" w:w="1656"/>
-            <w:shd w:fill="0B2545"/>
+            <w:tcW w:type="dxa" w:w="2340"/>
+            <w:shd w:fill="1E3A8A"/>
             <w:tcMar>
-              <w:top w:w="120" w:type="dxa"/>
-              <w:bottom w:w="120" w:type="dxa"/>
-              <w:left w:w="140" w:type="dxa"/>
-              <w:right w:w="140" w:type="dxa"/>
+              <w:top w:w="140" w:type="dxa"/>
+              <w:bottom w:w="140" w:type="dxa"/>
+              <w:left w:w="160" w:type="dxa"/>
+              <w:right w:w="160" w:type="dxa"/>
             </w:tcMar>
           </w:tcPr>
           <w:p>
@@ -944,21 +1741,23 @@
               <w:rPr>
                 <w:b/>
                 <w:color w:val="FFFFFF"/>
-                <w:sz w:val="19"/>
+                <w:sz w:val="20"/>
               </w:rPr>
-              <w:t>Accuracy</w:t>
+              <w:t>Transmission Channel</w:t>
             </w:r>
           </w:p>
         </w:tc>
+      </w:tr>
+      <w:tr>
         <w:tc>
           <w:tcPr>
-            <w:tcW w:type="dxa" w:w="1656"/>
-            <w:shd w:fill="0B2545"/>
+            <w:tcW w:type="dxa" w:w="2340"/>
+            <w:shd w:fill="F8FAFC"/>
             <w:tcMar>
-              <w:top w:w="120" w:type="dxa"/>
-              <w:bottom w:w="120" w:type="dxa"/>
-              <w:left w:w="140" w:type="dxa"/>
-              <w:right w:w="140" w:type="dxa"/>
+              <w:top w:w="100" w:type="dxa"/>
+              <w:bottom w:w="100" w:type="dxa"/>
+              <w:left w:w="160" w:type="dxa"/>
+              <w:right w:w="160" w:type="dxa"/>
             </w:tcMar>
           </w:tcPr>
           <w:p>
@@ -967,23 +1766,22 @@
             </w:pPr>
             <w:r>
               <w:rPr>
-                <w:b/>
-                <w:color w:val="FFFFFF"/>
+                <w:color w:val="1F2937"/>
                 <w:sz w:val="19"/>
               </w:rPr>
-              <w:t>Precision</w:t>
+              <w:t>CO-16</w:t>
             </w:r>
           </w:p>
         </w:tc>
         <w:tc>
           <w:tcPr>
-            <w:tcW w:type="dxa" w:w="1656"/>
-            <w:shd w:fill="0B2545"/>
+            <w:tcW w:type="dxa" w:w="2340"/>
+            <w:shd w:fill="F8FAFC"/>
             <w:tcMar>
-              <w:top w:w="120" w:type="dxa"/>
-              <w:bottom w:w="120" w:type="dxa"/>
-              <w:left w:w="140" w:type="dxa"/>
-              <w:right w:w="140" w:type="dxa"/>
+              <w:top w:w="100" w:type="dxa"/>
+              <w:bottom w:w="100" w:type="dxa"/>
+              <w:left w:w="160" w:type="dxa"/>
+              <w:right w:w="160" w:type="dxa"/>
             </w:tcMar>
           </w:tcPr>
           <w:p>
@@ -992,11 +1790,58 @@
             </w:pPr>
             <w:r>
               <w:rPr>
-                <w:b/>
-                <w:color w:val="FFFFFF"/>
+                <w:color w:val="1F2937"/>
                 <w:sz w:val="19"/>
               </w:rPr>
-              <w:t>Recall</w:t>
+              <w:t>Claim lacks required information / medical documentation</w:t>
+            </w:r>
+          </w:p>
+        </w:tc>
+        <w:tc>
+          <w:tcPr>
+            <w:tcW w:type="dxa" w:w="2340"/>
+            <w:shd w:fill="F8FAFC"/>
+            <w:tcMar>
+              <w:top w:w="100" w:type="dxa"/>
+              <w:bottom w:w="100" w:type="dxa"/>
+              <w:left w:w="160" w:type="dxa"/>
+              <w:right w:w="160" w:type="dxa"/>
+            </w:tcMar>
+          </w:tcPr>
+          <w:p>
+            <w:pPr>
+              <w:spacing w:before="40" w:after="40"/>
+            </w:pPr>
+            <w:r>
+              <w:rPr>
+                <w:color w:val="1F2937"/>
+                <w:sz w:val="19"/>
+              </w:rPr>
+              <w:t>Appeal with itemized statement, certified charts, operative notes</w:t>
+            </w:r>
+          </w:p>
+        </w:tc>
+        <w:tc>
+          <w:tcPr>
+            <w:tcW w:type="dxa" w:w="2340"/>
+            <w:shd w:fill="F8FAFC"/>
+            <w:tcMar>
+              <w:top w:w="100" w:type="dxa"/>
+              <w:bottom w:w="100" w:type="dxa"/>
+              <w:left w:w="160" w:type="dxa"/>
+              <w:right w:w="160" w:type="dxa"/>
+            </w:tcMar>
+          </w:tcPr>
+          <w:p>
+            <w:pPr>
+              <w:spacing w:before="40" w:after="40"/>
+            </w:pPr>
+            <w:r>
+              <w:rPr>
+                <w:color w:val="1F2937"/>
+                <w:sz w:val="19"/>
+              </w:rPr>
+              <w:t>Payer Portal</w:t>
             </w:r>
           </w:p>
         </w:tc>
@@ -1004,145 +1849,97 @@
       <w:tr>
         <w:tc>
           <w:tcPr>
-            <w:tcW w:type="dxa" w:w="1656"/>
+            <w:tcW w:type="dxa" w:w="2340"/>
             <w:shd w:fill="FFFFFF"/>
             <w:tcMar>
-              <w:top w:w="80" w:type="dxa"/>
-              <w:bottom w:w="80" w:type="dxa"/>
-              <w:left w:w="120" w:type="dxa"/>
-              <w:right w:w="120" w:type="dxa"/>
+              <w:top w:w="100" w:type="dxa"/>
+              <w:bottom w:w="100" w:type="dxa"/>
+              <w:left w:w="160" w:type="dxa"/>
+              <w:right w:w="160" w:type="dxa"/>
             </w:tcMar>
           </w:tcPr>
           <w:p>
             <w:pPr>
-              <w:spacing w:before="20" w:after="20"/>
+              <w:spacing w:before="40" w:after="40"/>
             </w:pPr>
             <w:r>
               <w:rPr>
-                <w:color w:val="1E293B"/>
-                <w:sz w:val="18"/>
+                <w:color w:val="1F2937"/>
+                <w:sz w:val="19"/>
               </w:rPr>
-              <w:t>Adjudication Delay (was_delayed)</w:t>
+              <w:t>CO-50</w:t>
             </w:r>
           </w:p>
         </w:tc>
         <w:tc>
           <w:tcPr>
-            <w:tcW w:type="dxa" w:w="1656"/>
+            <w:tcW w:type="dxa" w:w="2340"/>
             <w:shd w:fill="FFFFFF"/>
             <w:tcMar>
-              <w:top w:w="80" w:type="dxa"/>
-              <w:bottom w:w="80" w:type="dxa"/>
-              <w:left w:w="120" w:type="dxa"/>
-              <w:right w:w="120" w:type="dxa"/>
+              <w:top w:w="100" w:type="dxa"/>
+              <w:bottom w:w="100" w:type="dxa"/>
+              <w:left w:w="160" w:type="dxa"/>
+              <w:right w:w="160" w:type="dxa"/>
             </w:tcMar>
           </w:tcPr>
           <w:p>
             <w:pPr>
-              <w:spacing w:before="20" w:after="20"/>
+              <w:spacing w:before="40" w:after="40"/>
             </w:pPr>
             <w:r>
               <w:rPr>
-                <w:color w:val="1E293B"/>
-                <w:sz w:val="18"/>
+                <w:color w:val="1F2937"/>
+                <w:sz w:val="19"/>
               </w:rPr>
-              <w:t>HistGradientBoosting</w:t>
+              <w:t>Non-covered service / Not deemed medically necessary</w:t>
             </w:r>
           </w:p>
         </w:tc>
         <w:tc>
           <w:tcPr>
-            <w:tcW w:type="dxa" w:w="1656"/>
+            <w:tcW w:type="dxa" w:w="2340"/>
             <w:shd w:fill="FFFFFF"/>
             <w:tcMar>
-              <w:top w:w="80" w:type="dxa"/>
-              <w:bottom w:w="80" w:type="dxa"/>
-              <w:left w:w="120" w:type="dxa"/>
-              <w:right w:w="120" w:type="dxa"/>
+              <w:top w:w="100" w:type="dxa"/>
+              <w:bottom w:w="100" w:type="dxa"/>
+              <w:left w:w="160" w:type="dxa"/>
+              <w:right w:w="160" w:type="dxa"/>
             </w:tcMar>
           </w:tcPr>
           <w:p>
             <w:pPr>
-              <w:spacing w:before="20" w:after="20"/>
+              <w:spacing w:before="40" w:after="40"/>
             </w:pPr>
             <w:r>
               <w:rPr>
-                <w:color w:val="1E293B"/>
-                <w:sz w:val="18"/>
+                <w:color w:val="1F2937"/>
+                <w:sz w:val="19"/>
               </w:rPr>
-              <w:t>0.7462</w:t>
+              <w:t>Appeal with physician letter &amp; request clinical peer-to-peer review</w:t>
             </w:r>
           </w:p>
         </w:tc>
         <w:tc>
           <w:tcPr>
-            <w:tcW w:type="dxa" w:w="1656"/>
+            <w:tcW w:type="dxa" w:w="2340"/>
             <w:shd w:fill="FFFFFF"/>
             <w:tcMar>
-              <w:top w:w="80" w:type="dxa"/>
-              <w:bottom w:w="80" w:type="dxa"/>
-              <w:left w:w="120" w:type="dxa"/>
-              <w:right w:w="120" w:type="dxa"/>
+              <w:top w:w="100" w:type="dxa"/>
+              <w:bottom w:w="100" w:type="dxa"/>
+              <w:left w:w="160" w:type="dxa"/>
+              <w:right w:w="160" w:type="dxa"/>
             </w:tcMar>
           </w:tcPr>
           <w:p>
             <w:pPr>
-              <w:spacing w:before="20" w:after="20"/>
+              <w:spacing w:before="40" w:after="40"/>
             </w:pPr>
             <w:r>
               <w:rPr>
-                <w:color w:val="1E293B"/>
-                <w:sz w:val="18"/>
+                <w:color w:val="1F2937"/>
+                <w:sz w:val="19"/>
               </w:rPr>
-              <w:t>79.20%</w:t>
-            </w:r>
-          </w:p>
-        </w:tc>
-        <w:tc>
-          <w:tcPr>
-            <w:tcW w:type="dxa" w:w="1656"/>
-            <w:shd w:fill="FFFFFF"/>
-            <w:tcMar>
-              <w:top w:w="80" w:type="dxa"/>
-              <w:bottom w:w="80" w:type="dxa"/>
-              <w:left w:w="120" w:type="dxa"/>
-              <w:right w:w="120" w:type="dxa"/>
-            </w:tcMar>
-          </w:tcPr>
-          <w:p>
-            <w:pPr>
-              <w:spacing w:before="20" w:after="20"/>
-            </w:pPr>
-            <w:r>
-              <w:rPr>
-                <w:color w:val="1E293B"/>
-                <w:sz w:val="18"/>
-              </w:rPr>
-              <w:t>82.07%</w:t>
-            </w:r>
-          </w:p>
-        </w:tc>
-        <w:tc>
-          <w:tcPr>
-            <w:tcW w:type="dxa" w:w="1656"/>
-            <w:shd w:fill="FFFFFF"/>
-            <w:tcMar>
-              <w:top w:w="80" w:type="dxa"/>
-              <w:bottom w:w="80" w:type="dxa"/>
-              <w:left w:w="120" w:type="dxa"/>
-              <w:right w:w="120" w:type="dxa"/>
-            </w:tcMar>
-          </w:tcPr>
-          <w:p>
-            <w:pPr>
-              <w:spacing w:before="20" w:after="20"/>
-            </w:pPr>
-            <w:r>
-              <w:rPr>
-                <w:color w:val="1E293B"/>
-                <w:sz w:val="18"/>
-              </w:rPr>
-              <w:t>93.05%</w:t>
+              <w:t>Phone / Medical Review</w:t>
             </w:r>
           </w:p>
         </w:tc>
@@ -1150,145 +1947,391 @@
       <w:tr>
         <w:tc>
           <w:tcPr>
-            <w:tcW w:type="dxa" w:w="1656"/>
+            <w:tcW w:type="dxa" w:w="2340"/>
             <w:shd w:fill="F8FAFC"/>
             <w:tcMar>
-              <w:top w:w="80" w:type="dxa"/>
-              <w:bottom w:w="80" w:type="dxa"/>
-              <w:left w:w="120" w:type="dxa"/>
-              <w:right w:w="120" w:type="dxa"/>
+              <w:top w:w="100" w:type="dxa"/>
+              <w:bottom w:w="100" w:type="dxa"/>
+              <w:left w:w="160" w:type="dxa"/>
+              <w:right w:w="160" w:type="dxa"/>
             </w:tcMar>
           </w:tcPr>
           <w:p>
             <w:pPr>
-              <w:spacing w:before="20" w:after="20"/>
+              <w:spacing w:before="40" w:after="40"/>
             </w:pPr>
             <w:r>
               <w:rPr>
-                <w:color w:val="1E293B"/>
-                <w:sz w:val="18"/>
+                <w:color w:val="1F2937"/>
+                <w:sz w:val="19"/>
               </w:rPr>
-              <w:t>Claim Denial (was_denied)</w:t>
+              <w:t>CO-197</w:t>
             </w:r>
           </w:p>
         </w:tc>
         <w:tc>
           <w:tcPr>
-            <w:tcW w:type="dxa" w:w="1656"/>
+            <w:tcW w:type="dxa" w:w="2340"/>
             <w:shd w:fill="F8FAFC"/>
             <w:tcMar>
-              <w:top w:w="80" w:type="dxa"/>
-              <w:bottom w:w="80" w:type="dxa"/>
-              <w:left w:w="120" w:type="dxa"/>
-              <w:right w:w="120" w:type="dxa"/>
+              <w:top w:w="100" w:type="dxa"/>
+              <w:bottom w:w="100" w:type="dxa"/>
+              <w:left w:w="160" w:type="dxa"/>
+              <w:right w:w="160" w:type="dxa"/>
             </w:tcMar>
           </w:tcPr>
           <w:p>
             <w:pPr>
-              <w:spacing w:before="20" w:after="20"/>
+              <w:spacing w:before="40" w:after="40"/>
             </w:pPr>
             <w:r>
               <w:rPr>
-                <w:color w:val="1E293B"/>
-                <w:sz w:val="18"/>
+                <w:color w:val="1F2937"/>
+                <w:sz w:val="19"/>
               </w:rPr>
-              <w:t>HistGradientBoosting</w:t>
+              <w:t>Precertification / Prior authorization absent</w:t>
             </w:r>
           </w:p>
         </w:tc>
         <w:tc>
           <w:tcPr>
-            <w:tcW w:type="dxa" w:w="1656"/>
+            <w:tcW w:type="dxa" w:w="2340"/>
             <w:shd w:fill="F8FAFC"/>
             <w:tcMar>
-              <w:top w:w="80" w:type="dxa"/>
-              <w:bottom w:w="80" w:type="dxa"/>
-              <w:left w:w="120" w:type="dxa"/>
-              <w:right w:w="120" w:type="dxa"/>
+              <w:top w:w="100" w:type="dxa"/>
+              <w:bottom w:w="100" w:type="dxa"/>
+              <w:left w:w="160" w:type="dxa"/>
+              <w:right w:w="160" w:type="dxa"/>
             </w:tcMar>
           </w:tcPr>
           <w:p>
             <w:pPr>
-              <w:spacing w:before="20" w:after="20"/>
+              <w:spacing w:before="40" w:after="40"/>
             </w:pPr>
             <w:r>
               <w:rPr>
-                <w:color w:val="1E293B"/>
-                <w:sz w:val="18"/>
+                <w:color w:val="1F2937"/>
+                <w:sz w:val="19"/>
               </w:rPr>
-              <w:t>0.7818</w:t>
+              <w:t>Retroactive authorization appeal with emergency/clinical proof</w:t>
             </w:r>
           </w:p>
         </w:tc>
         <w:tc>
           <w:tcPr>
-            <w:tcW w:type="dxa" w:w="1656"/>
+            <w:tcW w:type="dxa" w:w="2340"/>
             <w:shd w:fill="F8FAFC"/>
             <w:tcMar>
-              <w:top w:w="80" w:type="dxa"/>
-              <w:bottom w:w="80" w:type="dxa"/>
-              <w:left w:w="120" w:type="dxa"/>
-              <w:right w:w="120" w:type="dxa"/>
+              <w:top w:w="100" w:type="dxa"/>
+              <w:bottom w:w="100" w:type="dxa"/>
+              <w:left w:w="160" w:type="dxa"/>
+              <w:right w:w="160" w:type="dxa"/>
             </w:tcMar>
           </w:tcPr>
           <w:p>
             <w:pPr>
-              <w:spacing w:before="20" w:after="20"/>
+              <w:spacing w:before="40" w:after="40"/>
             </w:pPr>
             <w:r>
               <w:rPr>
-                <w:color w:val="1E293B"/>
-                <w:sz w:val="18"/>
+                <w:color w:val="1F2937"/>
+                <w:sz w:val="19"/>
               </w:rPr>
-              <w:t>82.00%</w:t>
+              <w:t>Secure Portal</w:t>
+            </w:r>
+          </w:p>
+        </w:tc>
+      </w:tr>
+      <w:tr>
+        <w:tc>
+          <w:tcPr>
+            <w:tcW w:type="dxa" w:w="2340"/>
+            <w:shd w:fill="FFFFFF"/>
+            <w:tcMar>
+              <w:top w:w="100" w:type="dxa"/>
+              <w:bottom w:w="100" w:type="dxa"/>
+              <w:left w:w="160" w:type="dxa"/>
+              <w:right w:w="160" w:type="dxa"/>
+            </w:tcMar>
+          </w:tcPr>
+          <w:p>
+            <w:pPr>
+              <w:spacing w:before="40" w:after="40"/>
+            </w:pPr>
+            <w:r>
+              <w:rPr>
+                <w:color w:val="1F2937"/>
+                <w:sz w:val="19"/>
+              </w:rPr>
+              <w:t>CO-29</w:t>
             </w:r>
           </w:p>
         </w:tc>
         <w:tc>
           <w:tcPr>
-            <w:tcW w:type="dxa" w:w="1656"/>
-            <w:shd w:fill="F8FAFC"/>
+            <w:tcW w:type="dxa" w:w="2340"/>
+            <w:shd w:fill="FFFFFF"/>
             <w:tcMar>
-              <w:top w:w="80" w:type="dxa"/>
-              <w:bottom w:w="80" w:type="dxa"/>
-              <w:left w:w="120" w:type="dxa"/>
-              <w:right w:w="120" w:type="dxa"/>
+              <w:top w:w="100" w:type="dxa"/>
+              <w:bottom w:w="100" w:type="dxa"/>
+              <w:left w:w="160" w:type="dxa"/>
+              <w:right w:w="160" w:type="dxa"/>
             </w:tcMar>
           </w:tcPr>
           <w:p>
             <w:pPr>
-              <w:spacing w:before="20" w:after="20"/>
+              <w:spacing w:before="40" w:after="40"/>
             </w:pPr>
             <w:r>
               <w:rPr>
-                <w:color w:val="1E293B"/>
-                <w:sz w:val="18"/>
+                <w:color w:val="1F2937"/>
+                <w:sz w:val="19"/>
               </w:rPr>
-              <w:t>68.06%</w:t>
+              <w:t>Timely filing limit exceeded</w:t>
             </w:r>
           </w:p>
         </w:tc>
         <w:tc>
           <w:tcPr>
-            <w:tcW w:type="dxa" w:w="1656"/>
-            <w:shd w:fill="F8FAFC"/>
+            <w:tcW w:type="dxa" w:w="2340"/>
+            <w:shd w:fill="FFFFFF"/>
             <w:tcMar>
-              <w:top w:w="80" w:type="dxa"/>
-              <w:bottom w:w="80" w:type="dxa"/>
-              <w:left w:w="120" w:type="dxa"/>
-              <w:right w:w="120" w:type="dxa"/>
+              <w:top w:w="100" w:type="dxa"/>
+              <w:bottom w:w="100" w:type="dxa"/>
+              <w:left w:w="160" w:type="dxa"/>
+              <w:right w:w="160" w:type="dxa"/>
             </w:tcMar>
           </w:tcPr>
           <w:p>
             <w:pPr>
-              <w:spacing w:before="20" w:after="20"/>
+              <w:spacing w:before="40" w:after="40"/>
             </w:pPr>
             <w:r>
               <w:rPr>
-                <w:color w:val="1E293B"/>
-                <w:sz w:val="18"/>
+                <w:color w:val="1F2937"/>
+                <w:sz w:val="19"/>
               </w:rPr>
-              <w:t>54.64%</w:t>
+              <w:t>Timely filing dispute attaching clearinghouse EDI 999/277 receipts</w:t>
+            </w:r>
+          </w:p>
+        </w:tc>
+        <w:tc>
+          <w:tcPr>
+            <w:tcW w:type="dxa" w:w="2340"/>
+            <w:shd w:fill="FFFFFF"/>
+            <w:tcMar>
+              <w:top w:w="100" w:type="dxa"/>
+              <w:bottom w:w="100" w:type="dxa"/>
+              <w:left w:w="160" w:type="dxa"/>
+              <w:right w:w="160" w:type="dxa"/>
+            </w:tcMar>
+          </w:tcPr>
+          <w:p>
+            <w:pPr>
+              <w:spacing w:before="40" w:after="40"/>
+            </w:pPr>
+            <w:r>
+              <w:rPr>
+                <w:color w:val="1F2937"/>
+                <w:sz w:val="19"/>
+              </w:rPr>
+              <w:t>Certified Mail / EDI</w:t>
+            </w:r>
+          </w:p>
+        </w:tc>
+      </w:tr>
+      <w:tr>
+        <w:tc>
+          <w:tcPr>
+            <w:tcW w:type="dxa" w:w="2340"/>
+            <w:shd w:fill="F8FAFC"/>
+            <w:tcMar>
+              <w:top w:w="100" w:type="dxa"/>
+              <w:bottom w:w="100" w:type="dxa"/>
+              <w:left w:w="160" w:type="dxa"/>
+              <w:right w:w="160" w:type="dxa"/>
+            </w:tcMar>
+          </w:tcPr>
+          <w:p>
+            <w:pPr>
+              <w:spacing w:before="40" w:after="40"/>
+            </w:pPr>
+            <w:r>
+              <w:rPr>
+                <w:color w:val="1F2937"/>
+                <w:sz w:val="19"/>
+              </w:rPr>
+              <w:t>CO-18</w:t>
+            </w:r>
+          </w:p>
+        </w:tc>
+        <w:tc>
+          <w:tcPr>
+            <w:tcW w:type="dxa" w:w="2340"/>
+            <w:shd w:fill="F8FAFC"/>
+            <w:tcMar>
+              <w:top w:w="100" w:type="dxa"/>
+              <w:bottom w:w="100" w:type="dxa"/>
+              <w:left w:w="160" w:type="dxa"/>
+              <w:right w:w="160" w:type="dxa"/>
+            </w:tcMar>
+          </w:tcPr>
+          <w:p>
+            <w:pPr>
+              <w:spacing w:before="40" w:after="40"/>
+            </w:pPr>
+            <w:r>
+              <w:rPr>
+                <w:color w:val="1F2937"/>
+                <w:sz w:val="19"/>
+              </w:rPr>
+              <w:t>Exact duplicate claim / service disallowance</w:t>
+            </w:r>
+          </w:p>
+        </w:tc>
+        <w:tc>
+          <w:tcPr>
+            <w:tcW w:type="dxa" w:w="2340"/>
+            <w:shd w:fill="F8FAFC"/>
+            <w:tcMar>
+              <w:top w:w="100" w:type="dxa"/>
+              <w:bottom w:w="100" w:type="dxa"/>
+              <w:left w:w="160" w:type="dxa"/>
+              <w:right w:w="160" w:type="dxa"/>
+            </w:tcMar>
+          </w:tcPr>
+          <w:p>
+            <w:pPr>
+              <w:spacing w:before="40" w:after="40"/>
+            </w:pPr>
+            <w:r>
+              <w:rPr>
+                <w:color w:val="1F2937"/>
+                <w:sz w:val="19"/>
+              </w:rPr>
+              <w:t>Resubmission with procedure modifiers (-59 distinct / -76 repeat)</w:t>
+            </w:r>
+          </w:p>
+        </w:tc>
+        <w:tc>
+          <w:tcPr>
+            <w:tcW w:type="dxa" w:w="2340"/>
+            <w:shd w:fill="F8FAFC"/>
+            <w:tcMar>
+              <w:top w:w="100" w:type="dxa"/>
+              <w:bottom w:w="100" w:type="dxa"/>
+              <w:left w:w="160" w:type="dxa"/>
+              <w:right w:w="160" w:type="dxa"/>
+            </w:tcMar>
+          </w:tcPr>
+          <w:p>
+            <w:pPr>
+              <w:spacing w:before="40" w:after="40"/>
+            </w:pPr>
+            <w:r>
+              <w:rPr>
+                <w:color w:val="1F2937"/>
+                <w:sz w:val="19"/>
+              </w:rPr>
+              <w:t>EDI Clearinghouse</w:t>
+            </w:r>
+          </w:p>
+        </w:tc>
+      </w:tr>
+      <w:tr>
+        <w:tc>
+          <w:tcPr>
+            <w:tcW w:type="dxa" w:w="2340"/>
+            <w:shd w:fill="FFFFFF"/>
+            <w:tcMar>
+              <w:top w:w="100" w:type="dxa"/>
+              <w:bottom w:w="100" w:type="dxa"/>
+              <w:left w:w="160" w:type="dxa"/>
+              <w:right w:w="160" w:type="dxa"/>
+            </w:tcMar>
+          </w:tcPr>
+          <w:p>
+            <w:pPr>
+              <w:spacing w:before="40" w:after="40"/>
+            </w:pPr>
+            <w:r>
+              <w:rPr>
+                <w:color w:val="1F2937"/>
+                <w:sz w:val="19"/>
+              </w:rPr>
+              <w:t>PR-1 / PR-2</w:t>
+            </w:r>
+          </w:p>
+        </w:tc>
+        <w:tc>
+          <w:tcPr>
+            <w:tcW w:type="dxa" w:w="2340"/>
+            <w:shd w:fill="FFFFFF"/>
+            <w:tcMar>
+              <w:top w:w="100" w:type="dxa"/>
+              <w:bottom w:w="100" w:type="dxa"/>
+              <w:left w:w="160" w:type="dxa"/>
+              <w:right w:w="160" w:type="dxa"/>
+            </w:tcMar>
+          </w:tcPr>
+          <w:p>
+            <w:pPr>
+              <w:spacing w:before="40" w:after="40"/>
+            </w:pPr>
+            <w:r>
+              <w:rPr>
+                <w:color w:val="1F2937"/>
+                <w:sz w:val="19"/>
+              </w:rPr>
+              <w:t>Patient Deductible / Co-insurance responsibility</w:t>
+            </w:r>
+          </w:p>
+        </w:tc>
+        <w:tc>
+          <w:tcPr>
+            <w:tcW w:type="dxa" w:w="2340"/>
+            <w:shd w:fill="FFFFFF"/>
+            <w:tcMar>
+              <w:top w:w="100" w:type="dxa"/>
+              <w:bottom w:w="100" w:type="dxa"/>
+              <w:left w:w="160" w:type="dxa"/>
+              <w:right w:w="160" w:type="dxa"/>
+            </w:tcMar>
+          </w:tcPr>
+          <w:p>
+            <w:pPr>
+              <w:spacing w:before="40" w:after="40"/>
+            </w:pPr>
+            <w:r>
+              <w:rPr>
+                <w:color w:val="1F2937"/>
+                <w:sz w:val="19"/>
+              </w:rPr>
+              <w:t>Reallocate balance to patient ledger; submit to secondary payer</w:t>
+            </w:r>
+          </w:p>
+        </w:tc>
+        <w:tc>
+          <w:tcPr>
+            <w:tcW w:type="dxa" w:w="2340"/>
+            <w:shd w:fill="FFFFFF"/>
+            <w:tcMar>
+              <w:top w:w="100" w:type="dxa"/>
+              <w:bottom w:w="100" w:type="dxa"/>
+              <w:left w:w="160" w:type="dxa"/>
+              <w:right w:w="160" w:type="dxa"/>
+            </w:tcMar>
+          </w:tcPr>
+          <w:p>
+            <w:pPr>
+              <w:spacing w:before="40" w:after="40"/>
+            </w:pPr>
+            <w:r>
+              <w:rPr>
+                <w:color w:val="1F2937"/>
+                <w:sz w:val="19"/>
+              </w:rPr>
+              <w:t>Billing System</w:t>
             </w:r>
           </w:p>
         </w:tc>
@@ -1300,43 +2343,41 @@
       </w:pPr>
     </w:p>
     <w:p>
-      <w:r>
-        <w:t>The High Recall (93.05%) on the Delay Model ensures that nearly all aging claims heading toward timely filing deadlines are proactively identified before financial forfeiture occurs.</w:t>
-      </w:r>
-    </w:p>
-    <w:p>
       <w:pPr>
-        <w:pStyle w:val="Heading2"/>
+        <w:pStyle w:val="Heading1"/>
+        <w:spacing w:before="280" w:after="120"/>
       </w:pPr>
       <w:r>
-        <w:t>3.3 Financially-Aware Priority &amp; Explainability Engine</w:t>
-      </w:r>
-    </w:p>
-    <w:p>
-      <w:r>
-        <w:t>Traditional healthcare work queues sort claims strictly by age (FIFO) or billed amount. RecoverAI calculates a composite, risk-adjusted priority score (0 to 100) using a multi-factor formula:</w:t>
+        <w:t>7. Technical Stack &amp; Execution Commands</w:t>
       </w:r>
     </w:p>
     <w:tbl>
       <w:tblPr>
         <w:tblW w:type="auto" w:w="0"/>
         <w:jc w:val="center"/>
+        <w:tblLayout w:type="fixed"/>
         <w:tblLook w:firstColumn="1" w:firstRow="1" w:lastColumn="0" w:lastRow="0" w:noHBand="0" w:noVBand="1" w:val="04A0"/>
       </w:tblPr>
       <w:tblGrid>
-        <w:gridCol w:w="9936"/>
+        <w:gridCol w:w="9360"/>
       </w:tblGrid>
       <w:tr>
         <w:tc>
           <w:tcPr>
-            <w:tcW w:type="dxa" w:w="9936"/>
-            <w:shd w:fill="FFFBEB"/>
+            <w:tcW w:type="dxa" w:w="9360"/>
+            <w:shd w:fill="EFF6FF"/>
             <w:tcMar>
               <w:top w:w="140" w:type="dxa"/>
               <w:bottom w:w="140" w:type="dxa"/>
               <w:left w:w="200" w:type="dxa"/>
               <w:right w:w="200" w:type="dxa"/>
             </w:tcMar>
+            <w:tcBorders>
+              <w:top w:val="none"/>
+              <w:bottom w:val="none"/>
+              <w:left w:val="single" w:sz="24" w:space="0" w:color="3B82F6"/>
+              <w:right w:val="none"/>
+            </w:tcBorders>
           </w:tcPr>
           <w:p>
             <w:pPr>
@@ -1345,25 +2386,28 @@
             <w:r>
               <w:rPr>
                 <w:b/>
-                <w:color w:val="004488"/>
+                <w:color w:val="1E3A8A"/>
                 <w:sz w:val="21"/>
               </w:rPr>
-              <w:t>📌 Priority Formula &amp; Mathematical Weighting</w:t>
+              <w:t>📌 System Technology Stack Summary</w:t>
               <w:br/>
             </w:r>
             <w:r>
               <w:rPr>
-                <w:color w:val="223344"/>
+                <w:color w:val="334155"/>
                 <w:sz w:val="19"/>
               </w:rPr>
-              <w:t>Priority Score = 100 × [ 0.45 × P(Recovery) + 0.30 × P(Delay) + 0.25 × (Outstanding_Amount / $50,000) ]</w:t>
+              <w:t>• Frontend: React 19, TypeScript, Vite, Tailwind CSS, Recharts, Lucide Icons</w:t>
               <w:br/>
+              <w:t>• Backend: Python 3.12, FastAPI, Uvicorn, Pydantic v2, SQLAlchemy 2.0 ORM</w:t>
               <w:br/>
-              <w:t>• P(Recovery): Calculated as (1.0 - P(Denial)) with adjustments for timely filing proximity and past appeal success.</w:t>
+              <w:t>• Data Store: SQLite (backend/data/ar_followup.db), 10,000 Claims</w:t>
               <w:br/>
-              <w:t>• Priority Bands: Critical (Score 85–100), High (Score 70–85), Medium (Score 40–70), Low (Score 0–40).</w:t>
+              <w:t>• Machine Learning: Scikit-Learn (HistGradientBoostingClassifier), NumPy, Pandas, Joblib</w:t>
               <w:br/>
-              <w:t>• Human-in-the-Loop Explainability: Automatically generates clear diagnostic bullet points (e.g. 'High balance: $52,105 at risk', 'Denial reason: Missing documentation', 'Filing deadline: 25 days remaining').</w:t>
+              <w:t>• Vector Search (RAG): Scikit-Learn TfidfVectorizer (N-grams 1-2, sublinear TF), Cosine Similarity</w:t>
+              <w:br/>
+              <w:t>• Test Suite: Pytest (58 automated test cases covering Phases 1 through 13)</w:t>
             </w:r>
           </w:p>
         </w:tc>
@@ -1379,1276 +2423,25 @@
         <w:pStyle w:val="Heading2"/>
       </w:pPr>
       <w:r>
-        <w:t>3.4 Payer Policy Vector RAG (Retrieval-Augmented Generation) Engine</w:t>
+        <w:t>7.1 Operational Commands</w:t>
       </w:r>
     </w:p>
     <w:p>
       <w:r>
-        <w:t>How RAG Works in RecoverAI:</w:t>
+        <w:t>• Launch Entire Platform: ./run.sh (Starts backend on port 8000 and frontend on port 5173)</w:t>
         <w:br/>
-        <w:t>1. Policy Corpus Vectorization: 40 structured policy documents across all 10 health plans are indexed into an in-memory TF-IDF vector space with sublinear term frequency scaling and n-gram analysis.</w:t>
+        <w:t>• Run Pytest Test Suite: PYTHONPATH=. backend/.venv/bin/pytest backend/tests/</w:t>
         <w:br/>
-        <w:t>2. Semantic Querying: When a claim is analyzed, a contextual query combining the payer name, denial reason, denial code, and clinical encounter type is vectorized.</w:t>
+        <w:t>• Run CLI Demonstration Script: backend/.venv/bin/python scripts/demo_walkthrough.py</w:t>
         <w:br/>
-        <w:t>3. Cosine Similarity Matching: The vector engine computes cosine similarity scores across all policy chunks, returning the top matching rules with exact paragraph references.</w:t>
+        <w:t>• Access Frontend Dashboard: http://localhost:5173</w:t>
         <w:br/>
-        <w:t>4. Knowledge Grounding: Extracts payer-specific filing deadlines, preferred communication channels (Portal vs. Phone vs. Mail), required clinical document checklists (operative reports, itemized bills, physician notes), and dispute escalation pathways.</w:t>
-      </w:r>
-    </w:p>
-    <w:p>
-      <w:r>
-        <w:t>Why RAG is Essential: Generative AI models without RAG frequently hallucinate non-existent filing deadlines or generic appeal legal jargon. Vector RAG ensures that every follow-up letter cites exact contractual clauses and lists the exact documents mandated by that specific payer's claims manual.</w:t>
-      </w:r>
-    </w:p>
-    <w:p>
-      <w:pPr>
-        <w:pStyle w:val="Heading2"/>
-      </w:pPr>
-      <w:r>
-        <w:t>3.5 Autonomous AI Follow-Up Agent</w:t>
-      </w:r>
-    </w:p>
-    <w:p>
-      <w:r>
-        <w:t>The AI Follow-Up Agent acts as the central reasoning hub of RecoverAI. It combines:</w:t>
-        <w:br/>
-        <w:t>1. Claim State: Disputed balance, days in AR, denial code, prior auth status.</w:t>
-        <w:br/>
-        <w:t>2. ML Risk Scores: P(Denial), P(Delay), P(Recovery), Priority Band.</w:t>
-        <w:br/>
-        <w:t>3. Grounded Policy Rules: Retrieved from the Vector RAG engine.</w:t>
-        <w:br/>
-        <w:t>4. Optimal Action Decision: Determines whether to file a Formal Appeal (for denials), submit a Status Inquiry (for delayed claims), issue a Corrected Claim Resubmission (for billing errors), or initiate a Supervisory Call Center Escalation (for overdue reviews).</w:t>
-        <w:br/>
-        <w:t>5. Optimal Channel: Selects Provider Portal (Availity, NaviNet), Phone, Secure Email, or EDI 837 based on payer preferences.</w:t>
-      </w:r>
-    </w:p>
-    <w:p>
-      <w:pPr>
-        <w:pStyle w:val="Heading2"/>
-      </w:pPr>
-      <w:r>
-        <w:t>3.6 Multi-Format Follow-Up Artifact Generator Studio</w:t>
-      </w:r>
-    </w:p>
-    <w:p>
-      <w:r>
-        <w:t>Once a decision is reached, the Generator synthesizes professional, publication-ready dispute packets across 5 formats:</w:t>
-        <w:br/>
-        <w:t>• Formal CMS-1500 / UB-04 Appeal Letters: Complete with legal headers, patient metadata, itemized charge tables, contractual citations, and certified exhibits checklists.</w:t>
-        <w:br/>
-        <w:t>• Provider Portal Inquiries: Condensed, formatted messages optimized for Availity, NaviNet, and Optum character limits.</w:t>
-        <w:br/>
-        <w:t>• Call Center Phone Scripts: Step-by-step interactive scripts for billers with branching negotiation dialogue and supervisor escalation triggers.</w:t>
-        <w:br/>
-        <w:t>• Secure HIPAA Email Templates: Encrypted communication drafts for designated payer provider relations representatives.</w:t>
-        <w:br/>
-        <w:t>• EDI 837 / 277 Replacement Packets: Structured electronic data interchange dispute notes.</w:t>
-      </w:r>
-    </w:p>
-    <w:p>
-      <w:pPr>
-        <w:pStyle w:val="Heading2"/>
-      </w:pPr>
-      <w:r>
-        <w:t>3.7 Probabilistic Payer Response Simulator</w:t>
-      </w:r>
-    </w:p>
-    <w:p>
-      <w:r>
-        <w:t>To test and validate revenue recovery without waiting 30-90 days for actual insurance adjudication, RecoverAI includes a mathematical Payer Response Simulator that models realistic adjudication outcomes:</w:t>
-      </w:r>
-    </w:p>
-    <w:p>
-      <w:r>
-        <w:t>• 4-Class Outcome Probability Distribution: Calculates dynamic probabilities for APPROVED_FULL (100% recovery), APPROVED_PARTIAL (65%-88% recovery), ADDITIONAL_INFO_REQUIRED (30-day suspension), and DENIAL_UPHELD (rejection maintained).</w:t>
-        <w:br/>
-        <w:t>• Action Quality &amp; Scenario Synergy Modifiers: Grounded RAG appeals with high-quality documentation boost approval probabilities by up to +25%, while low-quality submissions increase denial rates.</w:t>
-        <w:br/>
-        <w:t>• Realistic Remittance Advice: Generates electronic 835 Remittance narratives with real EFT tracking numbers (`EFT-PAY002-XXXXXX`) and turnaround days (e.g. 7-14 days).</w:t>
-      </w:r>
-    </w:p>
-    <w:p>
-      <w:pPr>
-        <w:pStyle w:val="Heading2"/>
-      </w:pPr>
-      <w:r>
-        <w:t>3.8 Autonomous Closed-Loop Recovery Engine</w:t>
-      </w:r>
-    </w:p>
-    <w:p>
-      <w:r>
-        <w:t>The Closed-Loop Engine integrates all subsystems into a self-driving revenue recovery loop that can execute across batches of 10 to 50 claims with a single click:</w:t>
-      </w:r>
-    </w:p>
-    <w:p>
-      <w:r>
-        <w:t>1. Ingestion: Filters and ranks top actionable unrecovered claims from SQLite.</w:t>
-        <w:br/>
-        <w:t>2. AI Strategy: Determines action, channel, and retrieves RAG policy.</w:t>
-        <w:br/>
-        <w:t>3. Generation: Compiles formal appeal documentation.</w:t>
-        <w:br/>
-        <w:t>4. Simulation: Executes probabilistic payer adjudication.</w:t>
-        <w:br/>
-        <w:t>5. State Transition: Updates SQLite `claim_status` (`Paid`, `In Review`, `Denied`), balances, and followup counts.</w:t>
-        <w:br/>
-        <w:t>6. Audit Logging: Commits records to `agent_actions`, `followups`, and `claim_outcomes`.</w:t>
-        <w:br/>
-        <w:t>7. Analytics Recomputation: Recomputes portfolio recovery yield, recovered revenue, and updated AR aging in real time.</w:t>
-      </w:r>
-    </w:p>
-    <w:p>
-      <w:pPr>
-        <w:pStyle w:val="Heading1"/>
-      </w:pPr>
-      <w:r>
-        <w:t>4. Why It Works &amp; How AI Agents Combine to Solve the Problem</w:t>
-      </w:r>
-    </w:p>
-    <w:p>
-      <w:r>
-        <w:t>The core innovation of RecoverAI lies in the harmonious integration of Machine Learning, Vector RAG, Autonomous Agents, and Automated Generation into a single unified closed loop:</w:t>
-      </w:r>
-    </w:p>
-    <w:tbl>
-      <w:tblPr>
-        <w:tblW w:type="auto" w:w="0"/>
-        <w:jc w:val="center"/>
-        <w:tblLook w:firstColumn="1" w:firstRow="1" w:lastColumn="0" w:lastRow="0" w:noHBand="0" w:noVBand="1" w:val="04A0"/>
-      </w:tblPr>
-      <w:tblGrid>
-        <w:gridCol w:w="9936"/>
-      </w:tblGrid>
-      <w:tr>
-        <w:tc>
-          <w:tcPr>
-            <w:tcW w:type="dxa" w:w="9936"/>
-            <w:shd w:fill="F0FDF4"/>
-            <w:tcMar>
-              <w:top w:w="140" w:type="dxa"/>
-              <w:bottom w:w="140" w:type="dxa"/>
-              <w:left w:w="200" w:type="dxa"/>
-              <w:right w:w="200" w:type="dxa"/>
-            </w:tcMar>
-          </w:tcPr>
-          <w:p>
-            <w:pPr>
-              <w:spacing w:before="40" w:after="80"/>
-            </w:pPr>
-            <w:r>
-              <w:rPr>
-                <w:b/>
-                <w:color w:val="004488"/>
-                <w:sz w:val="21"/>
-              </w:rPr>
-              <w:t>📌 The Closed-Loop Synergy Formula</w:t>
-              <w:br/>
-            </w:r>
-            <w:r>
-              <w:rPr>
-                <w:color w:val="223344"/>
-                <w:sz w:val="19"/>
-              </w:rPr>
-              <w:t>1. ML Predicts What is At Risk: Identifies high-balance claims approaching forfeiture that have high recoverability.</w:t>
-              <w:br/>
-              <w:t>2. RAG Explains Why and What Rules Apply: Injects exact contractual clauses and required document checklists.</w:t>
-              <w:br/>
-              <w:t>3. AI Agent Decides How to Act: Selects the highest-yield dispute pathway and communication channel.</w:t>
-              <w:br/>
-              <w:t>4. Generator Creates the Solution: Produces complete, grounded appeal packages ready for clearinghouse submission.</w:t>
-              <w:br/>
-              <w:t>5. Simulator &amp; Ledger Closes the Loop: Adjudicates outcomes, records recovered dollars, and updates dashboard metrics.</w:t>
-              <w:br/>
-              <w:br/>
-              <w:t>Result: Administrative follow-up time is reduced by 85%, timely filing forfeitures are virtually eliminated, and hospital cash flow recovery is accelerated by weeks.</w:t>
-            </w:r>
-          </w:p>
-        </w:tc>
-      </w:tr>
-    </w:tbl>
-    <w:p>
-      <w:pPr>
-        <w:spacing w:after="120"/>
-      </w:pPr>
-    </w:p>
-    <w:p>
-      <w:pPr>
-        <w:pStyle w:val="Heading1"/>
-      </w:pPr>
-      <w:r>
-        <w:t>5. Verification Results &amp; Test Suite Summary</w:t>
-      </w:r>
-    </w:p>
-    <w:p>
-      <w:r>
-        <w:t>RecoverAI has undergone complete automated end-to-end verification across all 13 project phases:</w:t>
-      </w:r>
-    </w:p>
-    <w:tbl>
-      <w:tblPr>
-        <w:tblW w:type="auto" w:w="0"/>
-        <w:jc w:val="center"/>
-        <w:tblLook w:firstColumn="1" w:firstRow="1" w:lastColumn="0" w:lastRow="0" w:noHBand="0" w:noVBand="1" w:val="04A0"/>
-      </w:tblPr>
-      <w:tblGrid>
-        <w:gridCol w:w="3312"/>
-        <w:gridCol w:w="3312"/>
-        <w:gridCol w:w="3312"/>
-      </w:tblGrid>
-      <w:tr>
-        <w:tc>
-          <w:tcPr>
-            <w:tcW w:type="dxa" w:w="3312"/>
-            <w:shd w:fill="0B2545"/>
-            <w:tcMar>
-              <w:top w:w="120" w:type="dxa"/>
-              <w:bottom w:w="120" w:type="dxa"/>
-              <w:left w:w="140" w:type="dxa"/>
-              <w:right w:w="140" w:type="dxa"/>
-            </w:tcMar>
-          </w:tcPr>
-          <w:p>
-            <w:pPr>
-              <w:spacing w:before="40" w:after="40"/>
-            </w:pPr>
-            <w:r>
-              <w:rPr>
-                <w:b/>
-                <w:color w:val="FFFFFF"/>
-                <w:sz w:val="19"/>
-              </w:rPr>
-              <w:t>Phase #</w:t>
-            </w:r>
-          </w:p>
-        </w:tc>
-        <w:tc>
-          <w:tcPr>
-            <w:tcW w:type="dxa" w:w="3312"/>
-            <w:shd w:fill="0B2545"/>
-            <w:tcMar>
-              <w:top w:w="120" w:type="dxa"/>
-              <w:bottom w:w="120" w:type="dxa"/>
-              <w:left w:w="140" w:type="dxa"/>
-              <w:right w:w="140" w:type="dxa"/>
-            </w:tcMar>
-          </w:tcPr>
-          <w:p>
-            <w:pPr>
-              <w:spacing w:before="40" w:after="40"/>
-            </w:pPr>
-            <w:r>
-              <w:rPr>
-                <w:b/>
-                <w:color w:val="FFFFFF"/>
-                <w:sz w:val="19"/>
-              </w:rPr>
-              <w:t>Component Tested</w:t>
-            </w:r>
-          </w:p>
-        </w:tc>
-        <w:tc>
-          <w:tcPr>
-            <w:tcW w:type="dxa" w:w="3312"/>
-            <w:shd w:fill="0B2545"/>
-            <w:tcMar>
-              <w:top w:w="120" w:type="dxa"/>
-              <w:bottom w:w="120" w:type="dxa"/>
-              <w:left w:w="140" w:type="dxa"/>
-              <w:right w:w="140" w:type="dxa"/>
-            </w:tcMar>
-          </w:tcPr>
-          <w:p>
-            <w:pPr>
-              <w:spacing w:before="40" w:after="40"/>
-            </w:pPr>
-            <w:r>
-              <w:rPr>
-                <w:b/>
-                <w:color w:val="FFFFFF"/>
-                <w:sz w:val="19"/>
-              </w:rPr>
-              <w:t>Verification Status</w:t>
-            </w:r>
-          </w:p>
-        </w:tc>
-      </w:tr>
-      <w:tr>
-        <w:tc>
-          <w:tcPr>
-            <w:tcW w:type="dxa" w:w="3312"/>
-            <w:shd w:fill="FFFFFF"/>
-            <w:tcMar>
-              <w:top w:w="80" w:type="dxa"/>
-              <w:bottom w:w="80" w:type="dxa"/>
-              <w:left w:w="120" w:type="dxa"/>
-              <w:right w:w="120" w:type="dxa"/>
-            </w:tcMar>
-          </w:tcPr>
-          <w:p>
-            <w:pPr>
-              <w:spacing w:before="20" w:after="20"/>
-            </w:pPr>
-            <w:r>
-              <w:rPr>
-                <w:color w:val="1E293B"/>
-                <w:sz w:val="18"/>
-              </w:rPr>
-              <w:t>Phase 1</w:t>
-            </w:r>
-          </w:p>
-        </w:tc>
-        <w:tc>
-          <w:tcPr>
-            <w:tcW w:type="dxa" w:w="3312"/>
-            <w:shd w:fill="FFFFFF"/>
-            <w:tcMar>
-              <w:top w:w="80" w:type="dxa"/>
-              <w:bottom w:w="80" w:type="dxa"/>
-              <w:left w:w="120" w:type="dxa"/>
-              <w:right w:w="120" w:type="dxa"/>
-            </w:tcMar>
-          </w:tcPr>
-          <w:p>
-            <w:pPr>
-              <w:spacing w:before="20" w:after="20"/>
-            </w:pPr>
-            <w:r>
-              <w:rPr>
-                <w:color w:val="1E293B"/>
-                <w:sz w:val="18"/>
-              </w:rPr>
-              <w:t>FastAPI Foundation &amp; System Health Endpoints</w:t>
-            </w:r>
-          </w:p>
-        </w:tc>
-        <w:tc>
-          <w:tcPr>
-            <w:tcW w:type="dxa" w:w="3312"/>
-            <w:shd w:fill="FFFFFF"/>
-            <w:tcMar>
-              <w:top w:w="80" w:type="dxa"/>
-              <w:bottom w:w="80" w:type="dxa"/>
-              <w:left w:w="120" w:type="dxa"/>
-              <w:right w:w="120" w:type="dxa"/>
-            </w:tcMar>
-          </w:tcPr>
-          <w:p>
-            <w:pPr>
-              <w:spacing w:before="20" w:after="20"/>
-            </w:pPr>
-            <w:r>
-              <w:rPr>
-                <w:color w:val="1E293B"/>
-                <w:sz w:val="18"/>
-              </w:rPr>
-              <w:t>PASSED (4/4 tests)</w:t>
-            </w:r>
-          </w:p>
-        </w:tc>
-      </w:tr>
-      <w:tr>
-        <w:tc>
-          <w:tcPr>
-            <w:tcW w:type="dxa" w:w="3312"/>
-            <w:shd w:fill="F8FAFC"/>
-            <w:tcMar>
-              <w:top w:w="80" w:type="dxa"/>
-              <w:bottom w:w="80" w:type="dxa"/>
-              <w:left w:w="120" w:type="dxa"/>
-              <w:right w:w="120" w:type="dxa"/>
-            </w:tcMar>
-          </w:tcPr>
-          <w:p>
-            <w:pPr>
-              <w:spacing w:before="20" w:after="20"/>
-            </w:pPr>
-            <w:r>
-              <w:rPr>
-                <w:color w:val="1E293B"/>
-                <w:sz w:val="18"/>
-              </w:rPr>
-              <w:t>Phase 2</w:t>
-            </w:r>
-          </w:p>
-        </w:tc>
-        <w:tc>
-          <w:tcPr>
-            <w:tcW w:type="dxa" w:w="3312"/>
-            <w:shd w:fill="F8FAFC"/>
-            <w:tcMar>
-              <w:top w:w="80" w:type="dxa"/>
-              <w:bottom w:w="80" w:type="dxa"/>
-              <w:left w:w="120" w:type="dxa"/>
-              <w:right w:w="120" w:type="dxa"/>
-            </w:tcMar>
-          </w:tcPr>
-          <w:p>
-            <w:pPr>
-              <w:spacing w:before="20" w:after="20"/>
-            </w:pPr>
-            <w:r>
-              <w:rPr>
-                <w:color w:val="1E293B"/>
-                <w:sz w:val="18"/>
-              </w:rPr>
-              <w:t>SQLite Database &amp; 30,000+ Production Dataset</w:t>
-            </w:r>
-          </w:p>
-        </w:tc>
-        <w:tc>
-          <w:tcPr>
-            <w:tcW w:type="dxa" w:w="3312"/>
-            <w:shd w:fill="F8FAFC"/>
-            <w:tcMar>
-              <w:top w:w="80" w:type="dxa"/>
-              <w:bottom w:w="80" w:type="dxa"/>
-              <w:left w:w="120" w:type="dxa"/>
-              <w:right w:w="120" w:type="dxa"/>
-            </w:tcMar>
-          </w:tcPr>
-          <w:p>
-            <w:pPr>
-              <w:spacing w:before="20" w:after="20"/>
-            </w:pPr>
-            <w:r>
-              <w:rPr>
-                <w:color w:val="1E293B"/>
-                <w:sz w:val="18"/>
-              </w:rPr>
-              <w:t>PASSED (4/4 tests)</w:t>
-            </w:r>
-          </w:p>
-        </w:tc>
-      </w:tr>
-      <w:tr>
-        <w:tc>
-          <w:tcPr>
-            <w:tcW w:type="dxa" w:w="3312"/>
-            <w:shd w:fill="FFFFFF"/>
-            <w:tcMar>
-              <w:top w:w="80" w:type="dxa"/>
-              <w:bottom w:w="80" w:type="dxa"/>
-              <w:left w:w="120" w:type="dxa"/>
-              <w:right w:w="120" w:type="dxa"/>
-            </w:tcMar>
-          </w:tcPr>
-          <w:p>
-            <w:pPr>
-              <w:spacing w:before="20" w:after="20"/>
-            </w:pPr>
-            <w:r>
-              <w:rPr>
-                <w:color w:val="1E293B"/>
-                <w:sz w:val="18"/>
-              </w:rPr>
-              <w:t>Phase 3</w:t>
-            </w:r>
-          </w:p>
-        </w:tc>
-        <w:tc>
-          <w:tcPr>
-            <w:tcW w:type="dxa" w:w="3312"/>
-            <w:shd w:fill="FFFFFF"/>
-            <w:tcMar>
-              <w:top w:w="80" w:type="dxa"/>
-              <w:bottom w:w="80" w:type="dxa"/>
-              <w:left w:w="120" w:type="dxa"/>
-              <w:right w:w="120" w:type="dxa"/>
-            </w:tcMar>
-          </w:tcPr>
-          <w:p>
-            <w:pPr>
-              <w:spacing w:before="20" w:after="20"/>
-            </w:pPr>
-            <w:r>
-              <w:rPr>
-                <w:color w:val="1E293B"/>
-                <w:sz w:val="18"/>
-              </w:rPr>
-              <w:t>Claims Explorer API with Pagination, Search &amp; Filters</w:t>
-            </w:r>
-          </w:p>
-        </w:tc>
-        <w:tc>
-          <w:tcPr>
-            <w:tcW w:type="dxa" w:w="3312"/>
-            <w:shd w:fill="FFFFFF"/>
-            <w:tcMar>
-              <w:top w:w="80" w:type="dxa"/>
-              <w:bottom w:w="80" w:type="dxa"/>
-              <w:left w:w="120" w:type="dxa"/>
-              <w:right w:w="120" w:type="dxa"/>
-            </w:tcMar>
-          </w:tcPr>
-          <w:p>
-            <w:pPr>
-              <w:spacing w:before="20" w:after="20"/>
-            </w:pPr>
-            <w:r>
-              <w:rPr>
-                <w:color w:val="1E293B"/>
-                <w:sz w:val="18"/>
-              </w:rPr>
-              <w:t>PASSED (10/10 tests)</w:t>
-            </w:r>
-          </w:p>
-        </w:tc>
-      </w:tr>
-      <w:tr>
-        <w:tc>
-          <w:tcPr>
-            <w:tcW w:type="dxa" w:w="3312"/>
-            <w:shd w:fill="F8FAFC"/>
-            <w:tcMar>
-              <w:top w:w="80" w:type="dxa"/>
-              <w:bottom w:w="80" w:type="dxa"/>
-              <w:left w:w="120" w:type="dxa"/>
-              <w:right w:w="120" w:type="dxa"/>
-            </w:tcMar>
-          </w:tcPr>
-          <w:p>
-            <w:pPr>
-              <w:spacing w:before="20" w:after="20"/>
-            </w:pPr>
-            <w:r>
-              <w:rPr>
-                <w:color w:val="1E293B"/>
-                <w:sz w:val="18"/>
-              </w:rPr>
-              <w:t>Phase 4</w:t>
-            </w:r>
-          </w:p>
-        </w:tc>
-        <w:tc>
-          <w:tcPr>
-            <w:tcW w:type="dxa" w:w="3312"/>
-            <w:shd w:fill="F8FAFC"/>
-            <w:tcMar>
-              <w:top w:w="80" w:type="dxa"/>
-              <w:bottom w:w="80" w:type="dxa"/>
-              <w:left w:w="120" w:type="dxa"/>
-              <w:right w:w="120" w:type="dxa"/>
-            </w:tcMar>
-          </w:tcPr>
-          <w:p>
-            <w:pPr>
-              <w:spacing w:before="20" w:after="20"/>
-            </w:pPr>
-            <w:r>
-              <w:rPr>
-                <w:color w:val="1E293B"/>
-                <w:sz w:val="18"/>
-              </w:rPr>
-              <w:t>Dual Scikit-Learn ML Models (Delay &amp; Denial)</w:t>
-            </w:r>
-          </w:p>
-        </w:tc>
-        <w:tc>
-          <w:tcPr>
-            <w:tcW w:type="dxa" w:w="3312"/>
-            <w:shd w:fill="F8FAFC"/>
-            <w:tcMar>
-              <w:top w:w="80" w:type="dxa"/>
-              <w:bottom w:w="80" w:type="dxa"/>
-              <w:left w:w="120" w:type="dxa"/>
-              <w:right w:w="120" w:type="dxa"/>
-            </w:tcMar>
-          </w:tcPr>
-          <w:p>
-            <w:pPr>
-              <w:spacing w:before="20" w:after="20"/>
-            </w:pPr>
-            <w:r>
-              <w:rPr>
-                <w:color w:val="1E293B"/>
-                <w:sz w:val="18"/>
-              </w:rPr>
-              <w:t>PASSED (6/6 tests)</w:t>
-            </w:r>
-          </w:p>
-        </w:tc>
-      </w:tr>
-      <w:tr>
-        <w:tc>
-          <w:tcPr>
-            <w:tcW w:type="dxa" w:w="3312"/>
-            <w:shd w:fill="FFFFFF"/>
-            <w:tcMar>
-              <w:top w:w="80" w:type="dxa"/>
-              <w:bottom w:w="80" w:type="dxa"/>
-              <w:left w:w="120" w:type="dxa"/>
-              <w:right w:w="120" w:type="dxa"/>
-            </w:tcMar>
-          </w:tcPr>
-          <w:p>
-            <w:pPr>
-              <w:spacing w:before="20" w:after="20"/>
-            </w:pPr>
-            <w:r>
-              <w:rPr>
-                <w:color w:val="1E293B"/>
-                <w:sz w:val="18"/>
-              </w:rPr>
-              <w:t>Phase 5</w:t>
-            </w:r>
-          </w:p>
-        </w:tc>
-        <w:tc>
-          <w:tcPr>
-            <w:tcW w:type="dxa" w:w="3312"/>
-            <w:shd w:fill="FFFFFF"/>
-            <w:tcMar>
-              <w:top w:w="80" w:type="dxa"/>
-              <w:bottom w:w="80" w:type="dxa"/>
-              <w:left w:w="120" w:type="dxa"/>
-              <w:right w:w="120" w:type="dxa"/>
-            </w:tcMar>
-          </w:tcPr>
-          <w:p>
-            <w:pPr>
-              <w:spacing w:before="20" w:after="20"/>
-            </w:pPr>
-            <w:r>
-              <w:rPr>
-                <w:color w:val="1E293B"/>
-                <w:sz w:val="18"/>
-              </w:rPr>
-              <w:t>Priority Engine (0-100 Score &amp; Explainability Factors)</w:t>
-            </w:r>
-          </w:p>
-        </w:tc>
-        <w:tc>
-          <w:tcPr>
-            <w:tcW w:type="dxa" w:w="3312"/>
-            <w:shd w:fill="FFFFFF"/>
-            <w:tcMar>
-              <w:top w:w="80" w:type="dxa"/>
-              <w:bottom w:w="80" w:type="dxa"/>
-              <w:left w:w="120" w:type="dxa"/>
-              <w:right w:w="120" w:type="dxa"/>
-            </w:tcMar>
-          </w:tcPr>
-          <w:p>
-            <w:pPr>
-              <w:spacing w:before="20" w:after="20"/>
-            </w:pPr>
-            <w:r>
-              <w:rPr>
-                <w:color w:val="1E293B"/>
-                <w:sz w:val="18"/>
-              </w:rPr>
-              <w:t>PASSED (7/7 tests)</w:t>
-            </w:r>
-          </w:p>
-        </w:tc>
-      </w:tr>
-      <w:tr>
-        <w:tc>
-          <w:tcPr>
-            <w:tcW w:type="dxa" w:w="3312"/>
-            <w:shd w:fill="F8FAFC"/>
-            <w:tcMar>
-              <w:top w:w="80" w:type="dxa"/>
-              <w:bottom w:w="80" w:type="dxa"/>
-              <w:left w:w="120" w:type="dxa"/>
-              <w:right w:w="120" w:type="dxa"/>
-            </w:tcMar>
-          </w:tcPr>
-          <w:p>
-            <w:pPr>
-              <w:spacing w:before="20" w:after="20"/>
-            </w:pPr>
-            <w:r>
-              <w:rPr>
-                <w:color w:val="1E293B"/>
-                <w:sz w:val="18"/>
-              </w:rPr>
-              <w:t>Phase 6</w:t>
-            </w:r>
-          </w:p>
-        </w:tc>
-        <w:tc>
-          <w:tcPr>
-            <w:tcW w:type="dxa" w:w="3312"/>
-            <w:shd w:fill="F8FAFC"/>
-            <w:tcMar>
-              <w:top w:w="80" w:type="dxa"/>
-              <w:bottom w:w="80" w:type="dxa"/>
-              <w:left w:w="120" w:type="dxa"/>
-              <w:right w:w="120" w:type="dxa"/>
-            </w:tcMar>
-          </w:tcPr>
-          <w:p>
-            <w:pPr>
-              <w:spacing w:before="20" w:after="20"/>
-            </w:pPr>
-            <w:r>
-              <w:rPr>
-                <w:color w:val="1E293B"/>
-                <w:sz w:val="18"/>
-              </w:rPr>
-              <w:t>Executive Dashboard Analytics (AR Aging, Payer Aggregates)</w:t>
-            </w:r>
-          </w:p>
-        </w:tc>
-        <w:tc>
-          <w:tcPr>
-            <w:tcW w:type="dxa" w:w="3312"/>
-            <w:shd w:fill="F8FAFC"/>
-            <w:tcMar>
-              <w:top w:w="80" w:type="dxa"/>
-              <w:bottom w:w="80" w:type="dxa"/>
-              <w:left w:w="120" w:type="dxa"/>
-              <w:right w:w="120" w:type="dxa"/>
-            </w:tcMar>
-          </w:tcPr>
-          <w:p>
-            <w:pPr>
-              <w:spacing w:before="20" w:after="20"/>
-            </w:pPr>
-            <w:r>
-              <w:rPr>
-                <w:color w:val="1E293B"/>
-                <w:sz w:val="18"/>
-              </w:rPr>
-              <w:t>PASSED (5/5 tests)</w:t>
-            </w:r>
-          </w:p>
-        </w:tc>
-      </w:tr>
-      <w:tr>
-        <w:tc>
-          <w:tcPr>
-            <w:tcW w:type="dxa" w:w="3312"/>
-            <w:shd w:fill="FFFFFF"/>
-            <w:tcMar>
-              <w:top w:w="80" w:type="dxa"/>
-              <w:bottom w:w="80" w:type="dxa"/>
-              <w:left w:w="120" w:type="dxa"/>
-              <w:right w:w="120" w:type="dxa"/>
-            </w:tcMar>
-          </w:tcPr>
-          <w:p>
-            <w:pPr>
-              <w:spacing w:before="20" w:after="20"/>
-            </w:pPr>
-            <w:r>
-              <w:rPr>
-                <w:color w:val="1E293B"/>
-                <w:sz w:val="18"/>
-              </w:rPr>
-              <w:t>Phase 7</w:t>
-            </w:r>
-          </w:p>
-        </w:tc>
-        <w:tc>
-          <w:tcPr>
-            <w:tcW w:type="dxa" w:w="3312"/>
-            <w:shd w:fill="FFFFFF"/>
-            <w:tcMar>
-              <w:top w:w="80" w:type="dxa"/>
-              <w:bottom w:w="80" w:type="dxa"/>
-              <w:left w:w="120" w:type="dxa"/>
-              <w:right w:w="120" w:type="dxa"/>
-            </w:tcMar>
-          </w:tcPr>
-          <w:p>
-            <w:pPr>
-              <w:spacing w:before="20" w:after="20"/>
-            </w:pPr>
-            <w:r>
-              <w:rPr>
-                <w:color w:val="1E293B"/>
-                <w:sz w:val="18"/>
-              </w:rPr>
-              <w:t>Claim Detail Workspace (Clinical, Financial, Timeline)</w:t>
-            </w:r>
-          </w:p>
-        </w:tc>
-        <w:tc>
-          <w:tcPr>
-            <w:tcW w:type="dxa" w:w="3312"/>
-            <w:shd w:fill="FFFFFF"/>
-            <w:tcMar>
-              <w:top w:w="80" w:type="dxa"/>
-              <w:bottom w:w="80" w:type="dxa"/>
-              <w:left w:w="120" w:type="dxa"/>
-              <w:right w:w="120" w:type="dxa"/>
-            </w:tcMar>
-          </w:tcPr>
-          <w:p>
-            <w:pPr>
-              <w:spacing w:before="20" w:after="20"/>
-            </w:pPr>
-            <w:r>
-              <w:rPr>
-                <w:color w:val="1E293B"/>
-                <w:sz w:val="18"/>
-              </w:rPr>
-              <w:t>PASSED (2/2 tests)</w:t>
-            </w:r>
-          </w:p>
-        </w:tc>
-      </w:tr>
-      <w:tr>
-        <w:tc>
-          <w:tcPr>
-            <w:tcW w:type="dxa" w:w="3312"/>
-            <w:shd w:fill="F8FAFC"/>
-            <w:tcMar>
-              <w:top w:w="80" w:type="dxa"/>
-              <w:bottom w:w="80" w:type="dxa"/>
-              <w:left w:w="120" w:type="dxa"/>
-              <w:right w:w="120" w:type="dxa"/>
-            </w:tcMar>
-          </w:tcPr>
-          <w:p>
-            <w:pPr>
-              <w:spacing w:before="20" w:after="20"/>
-            </w:pPr>
-            <w:r>
-              <w:rPr>
-                <w:color w:val="1E293B"/>
-                <w:sz w:val="18"/>
-              </w:rPr>
-              <w:t>Phase 8</w:t>
-            </w:r>
-          </w:p>
-        </w:tc>
-        <w:tc>
-          <w:tcPr>
-            <w:tcW w:type="dxa" w:w="3312"/>
-            <w:shd w:fill="F8FAFC"/>
-            <w:tcMar>
-              <w:top w:w="80" w:type="dxa"/>
-              <w:bottom w:w="80" w:type="dxa"/>
-              <w:left w:w="120" w:type="dxa"/>
-              <w:right w:w="120" w:type="dxa"/>
-            </w:tcMar>
-          </w:tcPr>
-          <w:p>
-            <w:pPr>
-              <w:spacing w:before="20" w:after="20"/>
-            </w:pPr>
-            <w:r>
-              <w:rPr>
-                <w:color w:val="1E293B"/>
-                <w:sz w:val="18"/>
-              </w:rPr>
-              <w:t>Payer Policy Vector RAG Engine (TF-IDF Cosine Similarity)</w:t>
-            </w:r>
-          </w:p>
-        </w:tc>
-        <w:tc>
-          <w:tcPr>
-            <w:tcW w:type="dxa" w:w="3312"/>
-            <w:shd w:fill="F8FAFC"/>
-            <w:tcMar>
-              <w:top w:w="80" w:type="dxa"/>
-              <w:bottom w:w="80" w:type="dxa"/>
-              <w:left w:w="120" w:type="dxa"/>
-              <w:right w:w="120" w:type="dxa"/>
-            </w:tcMar>
-          </w:tcPr>
-          <w:p>
-            <w:pPr>
-              <w:spacing w:before="20" w:after="20"/>
-            </w:pPr>
-            <w:r>
-              <w:rPr>
-                <w:color w:val="1E293B"/>
-                <w:sz w:val="18"/>
-              </w:rPr>
-              <w:t>PASSED (6/6 tests)</w:t>
-            </w:r>
-          </w:p>
-        </w:tc>
-      </w:tr>
-      <w:tr>
-        <w:tc>
-          <w:tcPr>
-            <w:tcW w:type="dxa" w:w="3312"/>
-            <w:shd w:fill="FFFFFF"/>
-            <w:tcMar>
-              <w:top w:w="80" w:type="dxa"/>
-              <w:bottom w:w="80" w:type="dxa"/>
-              <w:left w:w="120" w:type="dxa"/>
-              <w:right w:w="120" w:type="dxa"/>
-            </w:tcMar>
-          </w:tcPr>
-          <w:p>
-            <w:pPr>
-              <w:spacing w:before="20" w:after="20"/>
-            </w:pPr>
-            <w:r>
-              <w:rPr>
-                <w:color w:val="1E293B"/>
-                <w:sz w:val="18"/>
-              </w:rPr>
-              <w:t>Phase 9</w:t>
-            </w:r>
-          </w:p>
-        </w:tc>
-        <w:tc>
-          <w:tcPr>
-            <w:tcW w:type="dxa" w:w="3312"/>
-            <w:shd w:fill="FFFFFF"/>
-            <w:tcMar>
-              <w:top w:w="80" w:type="dxa"/>
-              <w:bottom w:w="80" w:type="dxa"/>
-              <w:left w:w="120" w:type="dxa"/>
-              <w:right w:w="120" w:type="dxa"/>
-            </w:tcMar>
-          </w:tcPr>
-          <w:p>
-            <w:pPr>
-              <w:spacing w:before="20" w:after="20"/>
-            </w:pPr>
-            <w:r>
-              <w:rPr>
-                <w:color w:val="1E293B"/>
-                <w:sz w:val="18"/>
-              </w:rPr>
-              <w:t>Autonomous AI Follow-Up Agent &amp; Audit Log</w:t>
-            </w:r>
-          </w:p>
-        </w:tc>
-        <w:tc>
-          <w:tcPr>
-            <w:tcW w:type="dxa" w:w="3312"/>
-            <w:shd w:fill="FFFFFF"/>
-            <w:tcMar>
-              <w:top w:w="80" w:type="dxa"/>
-              <w:bottom w:w="80" w:type="dxa"/>
-              <w:left w:w="120" w:type="dxa"/>
-              <w:right w:w="120" w:type="dxa"/>
-            </w:tcMar>
-          </w:tcPr>
-          <w:p>
-            <w:pPr>
-              <w:spacing w:before="20" w:after="20"/>
-            </w:pPr>
-            <w:r>
-              <w:rPr>
-                <w:color w:val="1E293B"/>
-                <w:sz w:val="18"/>
-              </w:rPr>
-              <w:t>PASSED (5/5 tests)</w:t>
-            </w:r>
-          </w:p>
-        </w:tc>
-      </w:tr>
-      <w:tr>
-        <w:tc>
-          <w:tcPr>
-            <w:tcW w:type="dxa" w:w="3312"/>
-            <w:shd w:fill="F8FAFC"/>
-            <w:tcMar>
-              <w:top w:w="80" w:type="dxa"/>
-              <w:bottom w:w="80" w:type="dxa"/>
-              <w:left w:w="120" w:type="dxa"/>
-              <w:right w:w="120" w:type="dxa"/>
-            </w:tcMar>
-          </w:tcPr>
-          <w:p>
-            <w:pPr>
-              <w:spacing w:before="20" w:after="20"/>
-            </w:pPr>
-            <w:r>
-              <w:rPr>
-                <w:color w:val="1E293B"/>
-                <w:sz w:val="18"/>
-              </w:rPr>
-              <w:t>Phase 10</w:t>
-            </w:r>
-          </w:p>
-        </w:tc>
-        <w:tc>
-          <w:tcPr>
-            <w:tcW w:type="dxa" w:w="3312"/>
-            <w:shd w:fill="F8FAFC"/>
-            <w:tcMar>
-              <w:top w:w="80" w:type="dxa"/>
-              <w:bottom w:w="80" w:type="dxa"/>
-              <w:left w:w="120" w:type="dxa"/>
-              <w:right w:w="120" w:type="dxa"/>
-            </w:tcMar>
-          </w:tcPr>
-          <w:p>
-            <w:pPr>
-              <w:spacing w:before="20" w:after="20"/>
-            </w:pPr>
-            <w:r>
-              <w:rPr>
-                <w:color w:val="1E293B"/>
-                <w:sz w:val="18"/>
-              </w:rPr>
-              <w:t>Multi-Format Follow-Up Generator Studio (5 Formats)</w:t>
-            </w:r>
-          </w:p>
-        </w:tc>
-        <w:tc>
-          <w:tcPr>
-            <w:tcW w:type="dxa" w:w="3312"/>
-            <w:shd w:fill="F8FAFC"/>
-            <w:tcMar>
-              <w:top w:w="80" w:type="dxa"/>
-              <w:bottom w:w="80" w:type="dxa"/>
-              <w:left w:w="120" w:type="dxa"/>
-              <w:right w:w="120" w:type="dxa"/>
-            </w:tcMar>
-          </w:tcPr>
-          <w:p>
-            <w:pPr>
-              <w:spacing w:before="20" w:after="20"/>
-            </w:pPr>
-            <w:r>
-              <w:rPr>
-                <w:color w:val="1E293B"/>
-                <w:sz w:val="18"/>
-              </w:rPr>
-              <w:t>PASSED (4/4 tests)</w:t>
-            </w:r>
-          </w:p>
-        </w:tc>
-      </w:tr>
-      <w:tr>
-        <w:tc>
-          <w:tcPr>
-            <w:tcW w:type="dxa" w:w="3312"/>
-            <w:shd w:fill="FFFFFF"/>
-            <w:tcMar>
-              <w:top w:w="80" w:type="dxa"/>
-              <w:bottom w:w="80" w:type="dxa"/>
-              <w:left w:w="120" w:type="dxa"/>
-              <w:right w:w="120" w:type="dxa"/>
-            </w:tcMar>
-          </w:tcPr>
-          <w:p>
-            <w:pPr>
-              <w:spacing w:before="20" w:after="20"/>
-            </w:pPr>
-            <w:r>
-              <w:rPr>
-                <w:color w:val="1E293B"/>
-                <w:sz w:val="18"/>
-              </w:rPr>
-              <w:t>Phase 11</w:t>
-            </w:r>
-          </w:p>
-        </w:tc>
-        <w:tc>
-          <w:tcPr>
-            <w:tcW w:type="dxa" w:w="3312"/>
-            <w:shd w:fill="FFFFFF"/>
-            <w:tcMar>
-              <w:top w:w="80" w:type="dxa"/>
-              <w:bottom w:w="80" w:type="dxa"/>
-              <w:left w:w="120" w:type="dxa"/>
-              <w:right w:w="120" w:type="dxa"/>
-            </w:tcMar>
-          </w:tcPr>
-          <w:p>
-            <w:pPr>
-              <w:spacing w:before="20" w:after="20"/>
-            </w:pPr>
-            <w:r>
-              <w:rPr>
-                <w:color w:val="1E293B"/>
-                <w:sz w:val="18"/>
-              </w:rPr>
-              <w:t>Payer Response Simulator (4-Class Adjudication Model)</w:t>
-            </w:r>
-          </w:p>
-        </w:tc>
-        <w:tc>
-          <w:tcPr>
-            <w:tcW w:type="dxa" w:w="3312"/>
-            <w:shd w:fill="FFFFFF"/>
-            <w:tcMar>
-              <w:top w:w="80" w:type="dxa"/>
-              <w:bottom w:w="80" w:type="dxa"/>
-              <w:left w:w="120" w:type="dxa"/>
-              <w:right w:w="120" w:type="dxa"/>
-            </w:tcMar>
-          </w:tcPr>
-          <w:p>
-            <w:pPr>
-              <w:spacing w:before="20" w:after="20"/>
-            </w:pPr>
-            <w:r>
-              <w:rPr>
-                <w:color w:val="1E293B"/>
-                <w:sz w:val="18"/>
-              </w:rPr>
-              <w:t>PASSED (3/3 tests)</w:t>
-            </w:r>
-          </w:p>
-        </w:tc>
-      </w:tr>
-      <w:tr>
-        <w:tc>
-          <w:tcPr>
-            <w:tcW w:type="dxa" w:w="3312"/>
-            <w:shd w:fill="F8FAFC"/>
-            <w:tcMar>
-              <w:top w:w="80" w:type="dxa"/>
-              <w:bottom w:w="80" w:type="dxa"/>
-              <w:left w:w="120" w:type="dxa"/>
-              <w:right w:w="120" w:type="dxa"/>
-            </w:tcMar>
-          </w:tcPr>
-          <w:p>
-            <w:pPr>
-              <w:spacing w:before="20" w:after="20"/>
-            </w:pPr>
-            <w:r>
-              <w:rPr>
-                <w:color w:val="1E293B"/>
-                <w:sz w:val="18"/>
-              </w:rPr>
-              <w:t>Phase 12</w:t>
-            </w:r>
-          </w:p>
-        </w:tc>
-        <w:tc>
-          <w:tcPr>
-            <w:tcW w:type="dxa" w:w="3312"/>
-            <w:shd w:fill="F8FAFC"/>
-            <w:tcMar>
-              <w:top w:w="80" w:type="dxa"/>
-              <w:bottom w:w="80" w:type="dxa"/>
-              <w:left w:w="120" w:type="dxa"/>
-              <w:right w:w="120" w:type="dxa"/>
-            </w:tcMar>
-          </w:tcPr>
-          <w:p>
-            <w:pPr>
-              <w:spacing w:before="20" w:after="20"/>
-            </w:pPr>
-            <w:r>
-              <w:rPr>
-                <w:color w:val="1E293B"/>
-                <w:sz w:val="18"/>
-              </w:rPr>
-              <w:t>Closed-Loop Autonomous Recovery Engine</w:t>
-            </w:r>
-          </w:p>
-        </w:tc>
-        <w:tc>
-          <w:tcPr>
-            <w:tcW w:type="dxa" w:w="3312"/>
-            <w:shd w:fill="F8FAFC"/>
-            <w:tcMar>
-              <w:top w:w="80" w:type="dxa"/>
-              <w:bottom w:w="80" w:type="dxa"/>
-              <w:left w:w="120" w:type="dxa"/>
-              <w:right w:w="120" w:type="dxa"/>
-            </w:tcMar>
-          </w:tcPr>
-          <w:p>
-            <w:pPr>
-              <w:spacing w:before="20" w:after="20"/>
-            </w:pPr>
-            <w:r>
-              <w:rPr>
-                <w:color w:val="1E293B"/>
-                <w:sz w:val="18"/>
-              </w:rPr>
-              <w:t>PASSED (2/2 tests)</w:t>
-            </w:r>
-          </w:p>
-        </w:tc>
-      </w:tr>
-      <w:tr>
-        <w:tc>
-          <w:tcPr>
-            <w:tcW w:type="dxa" w:w="3312"/>
-            <w:shd w:fill="FFFFFF"/>
-            <w:tcMar>
-              <w:top w:w="80" w:type="dxa"/>
-              <w:bottom w:w="80" w:type="dxa"/>
-              <w:left w:w="120" w:type="dxa"/>
-              <w:right w:w="120" w:type="dxa"/>
-            </w:tcMar>
-          </w:tcPr>
-          <w:p>
-            <w:pPr>
-              <w:spacing w:before="20" w:after="20"/>
-            </w:pPr>
-            <w:r>
-              <w:rPr>
-                <w:color w:val="1E293B"/>
-                <w:sz w:val="18"/>
-              </w:rPr>
-              <w:t>Phase 13</w:t>
-            </w:r>
-          </w:p>
-        </w:tc>
-        <w:tc>
-          <w:tcPr>
-            <w:tcW w:type="dxa" w:w="3312"/>
-            <w:shd w:fill="FFFFFF"/>
-            <w:tcMar>
-              <w:top w:w="80" w:type="dxa"/>
-              <w:bottom w:w="80" w:type="dxa"/>
-              <w:left w:w="120" w:type="dxa"/>
-              <w:right w:w="120" w:type="dxa"/>
-            </w:tcMar>
-          </w:tcPr>
-          <w:p>
-            <w:pPr>
-              <w:spacing w:before="20" w:after="20"/>
-            </w:pPr>
-            <w:r>
-              <w:rPr>
-                <w:color w:val="1E293B"/>
-                <w:sz w:val="18"/>
-              </w:rPr>
-              <w:t>Final Polish, End-to-End Test Suite &amp; CLI Demo</w:t>
-            </w:r>
-          </w:p>
-        </w:tc>
-        <w:tc>
-          <w:tcPr>
-            <w:tcW w:type="dxa" w:w="3312"/>
-            <w:shd w:fill="FFFFFF"/>
-            <w:tcMar>
-              <w:top w:w="80" w:type="dxa"/>
-              <w:bottom w:w="80" w:type="dxa"/>
-              <w:left w:w="120" w:type="dxa"/>
-              <w:right w:w="120" w:type="dxa"/>
-            </w:tcMar>
-          </w:tcPr>
-          <w:p>
-            <w:pPr>
-              <w:spacing w:before="20" w:after="20"/>
-            </w:pPr>
-            <w:r>
-              <w:rPr>
-                <w:color w:val="1E293B"/>
-                <w:sz w:val="18"/>
-              </w:rPr>
-              <w:t>PASSED (2/2 tests)</w:t>
-            </w:r>
-          </w:p>
-        </w:tc>
-      </w:tr>
-    </w:tbl>
-    <w:p>
-      <w:pPr>
-        <w:spacing w:after="120"/>
-      </w:pPr>
-    </w:p>
-    <w:p>
-      <w:r>
-        <w:t>Total Test Suite Score: 60 passed in 1.40s with 0 errors. Frontend build: 100% clean TypeScript/Vite compilation.</w:t>
+        <w:t>• Access Swagger API Docs: http://127.0.0.1:8000/docs</w:t>
       </w:r>
     </w:p>
     <w:sectPr>
       <w:pgSz w:w="12240" w:h="15840"/>
-      <w:pgMar w:top="1152" w:right="1152" w:bottom="1152" w:left="1152" w:header="720" w:footer="720" w:gutter="0"/>
+      <w:pgMar w:top="1440" w:right="1440" w:bottom="1440" w:left="1440" w:header="720" w:footer="720" w:gutter="0"/>
       <w:cols w:space="720"/>
       <w:docGrid w:linePitch="360"/>
     </w:sectPr>

</xml_diff>